<commit_message>
Add versioned Zigbee and ISM workspaces with OOK and FSK decoding
</commit_message>
<xml_diff>
--- a/doc/Specification_Application_SDR_Zigbee.docx
+++ b/doc/Specification_Application_SDR_Zigbee.docx
@@ -4,6 +4,7 @@
   <w:body>
     <w:p>
       <w:pPr>
+        <w:pStyle w:val="Titre"/>
         <w:jc w:val="center"/>
         <w:rPr>
           <w:rFonts w:hint="eastAsia"/>
@@ -12,11 +13,9 @@
       </w:pPr>
       <w:r>
         <w:rPr>
-          <w:b/>
-          <w:sz w:val="28"/>
-          <w:lang w:val="fr-FR"/>
-        </w:rPr>
-        <w:t>SPÉCIFICATION LOGICIELLE</w:t>
+          <w:color w:val="000000"/>
+        </w:rPr>
+        <w:t>Spécification logicielle SDR multibande</w:t>
       </w:r>
     </w:p>
     <w:p>
@@ -29,16 +28,11 @@
       </w:pPr>
       <w:r>
         <w:rPr>
-          <w:lang w:val="fr-FR"/>
-        </w:rPr>
-        <w:t>Analyseur SDR évolutif</w:t>
-      </w:r>
-      <w:r>
-        <w:rPr>
-          <w:lang w:val="fr-FR"/>
-        </w:rPr>
+          <w:color w:val="000000"/>
+        </w:rPr>
+        <w:t>Analyseur Zigbee et ISM</w:t>
         <w:br/>
-        <w:t>avec décodage Zigbee</w:t>
+        <w:t>433 MHz et 868 MHz</w:t>
       </w:r>
     </w:p>
     <w:p>
@@ -50,12 +44,9 @@
         </w:rPr>
       </w:pPr>
       <w:r>
-        <w:rPr>
-          <w:i/>
-          <w:sz w:val="26"/>
-          <w:lang w:val="fr-FR"/>
-        </w:rPr>
-        <w:t>Acquisition I/Q • Spectre • Waterfall • Démodulation • Décodage protocolaire</w:t>
+        <w:t>Version 0.2.0 du 10 septembre 2026</w:t>
+        <w:br/>
+        <w:t>Réception I/Q, spectre, waterfall et décodage de dispositifs</w:t>
       </w:r>
     </w:p>
     <w:p>
@@ -86,6 +77,8 @@
       <w:tr>
         <w:trPr>
           <w:jc w:val="center"/>
+          <w:tblHeader/>
+          <w:cantSplit/>
         </w:trPr>
         <w:tc>
           <w:tcPr>
@@ -100,6 +93,7 @@
           </w:tcPr>
           <w:p>
             <w:pPr>
+              <w:keepNext/>
               <w:rPr>
                 <w:rFonts w:hint="eastAsia"/>
               </w:rPr>
@@ -124,6 +118,7 @@
           </w:tcPr>
           <w:p>
             <w:pPr>
+              <w:keepNext/>
               <w:rPr>
                 <w:rFonts w:hint="eastAsia"/>
                 <w:lang w:val="fr-FR"/>
@@ -141,6 +136,7 @@
       <w:tr>
         <w:trPr>
           <w:jc w:val="center"/>
+          <w:cantSplit/>
         </w:trPr>
         <w:tc>
           <w:tcPr>
@@ -178,13 +174,8 @@
             </w:tcMar>
           </w:tcPr>
           <w:p>
-            <w:pPr>
-              <w:rPr>
-                <w:rFonts w:hint="eastAsia"/>
-              </w:rPr>
-            </w:pPr>
-            <w:r>
-              <w:t>0.1</w:t>
+            <w:r>
+              <w:t>0.2.0</w:t>
             </w:r>
           </w:p>
         </w:tc>
@@ -192,6 +183,7 @@
       <w:tr>
         <w:trPr>
           <w:jc w:val="center"/>
+          <w:cantSplit/>
         </w:trPr>
         <w:tc>
           <w:tcPr>
@@ -229,13 +221,8 @@
             </w:tcMar>
           </w:tcPr>
           <w:p>
-            <w:pPr>
-              <w:rPr>
-                <w:rFonts w:hint="eastAsia"/>
-              </w:rPr>
-            </w:pPr>
-            <w:r>
-              <w:t>8 septembre 2026</w:t>
+            <w:r>
+              <w:t>10 septembre 2026</w:t>
             </w:r>
           </w:p>
         </w:tc>
@@ -243,6 +230,7 @@
       <w:tr>
         <w:trPr>
           <w:jc w:val="center"/>
+          <w:cantSplit/>
         </w:trPr>
         <w:tc>
           <w:tcPr>
@@ -294,6 +282,7 @@
       <w:tr>
         <w:trPr>
           <w:jc w:val="center"/>
+          <w:cantSplit/>
         </w:trPr>
         <w:tc>
           <w:tcPr>
@@ -374,6 +363,7 @@
       <w:tr>
         <w:trPr>
           <w:jc w:val="center"/>
+          <w:cantSplit/>
         </w:trPr>
         <w:tc>
           <w:tcPr>
@@ -388,6 +378,7 @@
           </w:tcPr>
           <w:p>
             <w:pPr>
+              <w:keepNext/>
               <w:rPr>
                 <w:rFonts w:hint="eastAsia"/>
                 <w:lang w:val="fr-FR"/>
@@ -403,6 +394,7 @@
           </w:p>
           <w:p>
             <w:pPr>
+              <w:keepNext/>
               <w:rPr>
                 <w:rFonts w:hint="eastAsia"/>
               </w:rPr>
@@ -435,6 +427,9 @@
         <w:pStyle w:val="Titre1"/>
       </w:pPr>
       <w:r>
+        <w:rPr>
+          <w:color w:val="000000"/>
+        </w:rPr>
         <w:lastRenderedPageBreak/>
         <w:t>1. Objet du projet</w:t>
       </w:r>
@@ -460,10 +455,7 @@
         </w:rPr>
       </w:pPr>
       <w:r>
-        <w:rPr>
-          <w:lang w:val="fr-FR"/>
-        </w:rPr>
-        <w:t>La première cible protocolaire est Zigbee / IEEE 802.15.4 à des fins de mise au point d’un réseau domotique. L’architecture doit toutefois être conçue dès l’origine pour permettre l’ajout futur d’autres démodulateurs et décodeurs sans réécriture de l’interface graphique ni de la couche d’acquisition SDR.</w:t>
+        <w:t>La version 0.2.0 organise le diagnostic dans trois onglets : Zigbee 2,4 GHz, ISM 433 MHz et ISM 868 MHz. Chaque espace conserve ses réglages propres. Zigbee garde sa chaîne IEEE 802.15.4 ; les bandes ISM utilisent les décodeurs de dispositifs OOK/ASK et FSK de rtl_433. Le présent document définit les fonctions attendues et les limites de qualification.</w:t>
       </w:r>
     </w:p>
     <w:p>
@@ -474,10 +466,7 @@
         </w:rPr>
       </w:pPr>
       <w:r>
-        <w:rPr>
-          <w:lang w:val="fr-FR"/>
-        </w:rPr>
-        <w:t>Le SDR par defaut sera un Adalm-Pluto</w:t>
+        <w:t>Le SDR par défaut est un ADALM-Pluto. Le RTL-SDR peut recevoir directement les bandes 433 et 868 MHz dans les limites du tuner utilisé.</w:t>
       </w:r>
     </w:p>
     <w:p>
@@ -489,6 +478,7 @@
       </w:pPr>
       <w:r>
         <w:rPr>
+          <w:color w:val="000000"/>
           <w:lang w:val="fr-FR"/>
         </w:rPr>
         <w:t>2. Périmètre</w:t>
@@ -503,9 +493,9 @@
       </w:pPr>
       <w:r>
         <w:rPr>
-          <w:lang w:val="fr-FR"/>
-        </w:rPr>
-        <w:t>2.1 Inclus dans la première version</w:t>
+          <w:color w:val="000000"/>
+        </w:rPr>
+        <w:t>2.1 Fonctions de la version 0.2.0</w:t>
       </w:r>
     </w:p>
     <w:p>
@@ -678,10 +668,7 @@
         </w:rPr>
       </w:pPr>
       <w:r>
-        <w:rPr>
-          <w:lang w:val="fr-FR"/>
-        </w:rPr>
-        <w:t>Architecture de plugins pour futurs protocoles.</w:t>
+        <w:t>Architecture de plugins, espaces de travail persistants et décodage ISM OOK/ASK et FSK via rtl_433.</w:t>
       </w:r>
     </w:p>
     <w:p>
@@ -689,7 +676,10 @@
         <w:pStyle w:val="Titre2"/>
       </w:pPr>
       <w:r>
-        <w:t>2.2 Hors périmètre initial</w:t>
+        <w:rPr>
+          <w:color w:val="000000"/>
+        </w:rPr>
+        <w:t>2.2 Fonctions hors périmètre</w:t>
       </w:r>
     </w:p>
     <w:p>
@@ -757,6 +747,9 @@
         <w:pStyle w:val="Titre1"/>
       </w:pPr>
       <w:r>
+        <w:rPr>
+          <w:color w:val="000000"/>
+        </w:rPr>
         <w:t>3. Concept d’utilisation</w:t>
       </w:r>
     </w:p>
@@ -769,10 +762,7 @@
         </w:rPr>
       </w:pPr>
       <w:r>
-        <w:rPr>
-          <w:lang w:val="fr-FR"/>
-        </w:rPr>
-        <w:t>L’utilisateur lance l’application et choisit le périphérique SDR.</w:t>
+        <w:t>L’utilisateur lance l’application, lit sa version dans le titre puis sélectionne Zigbee, ISM 433 MHz ou ISM 868 MHz. Il retrouve les réglages enregistrés pour cet espace et choisit le récepteur SDR.</w:t>
       </w:r>
     </w:p>
     <w:p>
@@ -829,11 +819,7 @@
         </w:rPr>
       </w:pPr>
       <w:r>
-        <w:rPr>
-          <w:lang w:val="fr-FR"/>
-        </w:rPr>
-        <w:lastRenderedPageBreak/>
-        <w:t>Le troisième curseur vertical « Canal RX » est déplacé sur la porteuse à décoder. En mode Zigbee, il s’accroche automatiquement au canal IEEE 802.15.4 le plus proche.</w:t>
+        <w:t>Le curseur vertical Canal RX indique la fréquence à décoder. Il se verrouille sur les canaux 11 à 26 en Zigbee et se déplace librement dans les limites de l’onglet ISM. Une zone translucide représente la largeur nominale du canal sur le spectre et le waterfall.</w:t>
       </w:r>
     </w:p>
     <w:p>
@@ -845,10 +831,7 @@
         </w:rPr>
       </w:pPr>
       <w:r>
-        <w:rPr>
-          <w:lang w:val="fr-FR"/>
-        </w:rPr>
-        <w:t>Le démodulateur extrait les trames. Chaque trame détectée apparaît immédiatement dans le panneau de droite avec heure d’arrivée, canal, niveau reçu, résultat CRC/FCS et résumé.</w:t>
+        <w:t>Les trames reconnues apparaissent avec un horodatage, la fréquence RX, le contrôle d’intégrité disponible et un résumé. Les valeurs non fournies par le décodeur sont indiquées comme non renseignées, jamais fabriquées.</w:t>
       </w:r>
     </w:p>
     <w:p>
@@ -860,10 +843,7 @@
         </w:rPr>
       </w:pPr>
       <w:r>
-        <w:rPr>
-          <w:lang w:val="fr-FR"/>
-        </w:rPr>
-        <w:t>Un clic sur une trame affiche son décodage détaillé par couches : PHY → MAC → Zigbee NWK → APS → ZCL, ainsi que les octets bruts.</w:t>
+        <w:t>Un clic affiche les couches Zigbee ou les champs du dispositif ISM. Les octets bruts sont montrés lorsqu’ils sont fournis ; sinon l’interface affiche explicitement leur absence et le résultat structuré du décodeur.</w:t>
       </w:r>
     </w:p>
     <w:p>
@@ -890,6 +870,7 @@
       </w:pPr>
       <w:r>
         <w:rPr>
+          <w:color w:val="000000"/>
           <w:lang w:val="fr-FR"/>
         </w:rPr>
         <w:t>4. Interface graphique (HMI)</w:t>
@@ -904,6 +885,7 @@
       </w:pPr>
       <w:r>
         <w:rPr>
+          <w:color w:val="000000"/>
           <w:lang w:val="fr-FR"/>
         </w:rPr>
         <w:t>4.1 Organisation générale de la fenêtre</w:t>
@@ -917,10 +899,7 @@
         </w:rPr>
       </w:pPr>
       <w:r>
-        <w:rPr>
-          <w:lang w:val="fr-FR"/>
-        </w:rPr>
-        <w:t>La fenêtre principale est divisée en deux zones : environ 65–70 % de la largeur pour la visualisation RF et 30–35 % pour l’analyse des trames.</w:t>
+        <w:t>La barre de titre et l’en-tête affichent la version logicielle. Trois onglets sont placés au-dessus des réglages. L’espace sélectionné partage environ 65 à 70 % de la largeur pour le spectre et le waterfall, et 30 à 35 % pour les trames et leurs détails.</w:t>
       </w:r>
     </w:p>
     <w:tbl>
@@ -939,6 +918,7 @@
         <w:trPr>
           <w:tblHeader/>
           <w:jc w:val="center"/>
+          <w:cantSplit/>
         </w:trPr>
         <w:tc>
           <w:tcPr>
@@ -947,6 +927,7 @@
           </w:tcPr>
           <w:p>
             <w:pPr>
+              <w:keepNext/>
               <w:rPr>
                 <w:rFonts w:hint="eastAsia"/>
               </w:rPr>
@@ -966,6 +947,7 @@
           </w:tcPr>
           <w:p>
             <w:pPr>
+              <w:keepNext/>
               <w:rPr>
                 <w:rFonts w:hint="eastAsia"/>
               </w:rPr>
@@ -985,6 +967,7 @@
           </w:tcPr>
           <w:p>
             <w:pPr>
+              <w:keepNext/>
               <w:rPr>
                 <w:rFonts w:hint="eastAsia"/>
               </w:rPr>
@@ -1001,6 +984,7 @@
       <w:tr>
         <w:trPr>
           <w:jc w:val="center"/>
+          <w:cantSplit/>
         </w:trPr>
         <w:tc>
           <w:tcPr>
@@ -1034,13 +1018,8 @@
             </w:tcMar>
           </w:tcPr>
           <w:p>
-            <w:pPr>
-              <w:rPr>
-                <w:rFonts w:hint="eastAsia"/>
-              </w:rPr>
-            </w:pPr>
-            <w:r>
-              <w:t>Sélection SDR, Start/Stop, gain, fréquence centrale, SPAN, protocole</w:t>
+            <w:r>
+              <w:t>Version visible, onglets Zigbee / ISM 433 / ISM 868, commandes SDR et paramètres de la bande</w:t>
             </w:r>
           </w:p>
         </w:tc>
@@ -1073,6 +1052,7 @@
       <w:tr>
         <w:trPr>
           <w:jc w:val="center"/>
+          <w:cantSplit/>
         </w:trPr>
         <w:tc>
           <w:tcPr>
@@ -1106,13 +1086,8 @@
             </w:tcMar>
           </w:tcPr>
           <w:p>
-            <w:pPr>
-              <w:rPr>
-                <w:rFonts w:hint="eastAsia"/>
-              </w:rPr>
-            </w:pPr>
-            <w:r>
-              <w:t>Puissance vs fréquence</w:t>
+            <w:r>
+              <w:t>Puissance par bin en dBFS, marqueur RX et zone de largeur du canal</w:t>
             </w:r>
           </w:p>
         </w:tc>
@@ -1145,6 +1120,7 @@
       <w:tr>
         <w:trPr>
           <w:jc w:val="center"/>
+          <w:cantSplit/>
         </w:trPr>
         <w:tc>
           <w:tcPr>
@@ -1217,6 +1193,7 @@
       <w:tr>
         <w:trPr>
           <w:jc w:val="center"/>
+          <w:cantSplit/>
         </w:trPr>
         <w:tc>
           <w:tcPr>
@@ -1289,6 +1266,7 @@
       <w:tr>
         <w:trPr>
           <w:jc w:val="center"/>
+          <w:cantSplit/>
         </w:trPr>
         <w:tc>
           <w:tcPr>
@@ -1364,6 +1342,9 @@
         <w:pStyle w:val="Titre2"/>
       </w:pPr>
       <w:r>
+        <w:rPr>
+          <w:color w:val="000000"/>
+        </w:rPr>
         <w:t>4.2 Curseurs de réglage</w:t>
       </w:r>
     </w:p>
@@ -1384,6 +1365,7 @@
         <w:trPr>
           <w:tblHeader/>
           <w:jc w:val="center"/>
+          <w:cantSplit/>
         </w:trPr>
         <w:tc>
           <w:tcPr>
@@ -1398,6 +1380,7 @@
           </w:tcPr>
           <w:p>
             <w:pPr>
+              <w:keepNext/>
               <w:rPr>
                 <w:rFonts w:hint="eastAsia"/>
               </w:rPr>
@@ -1423,6 +1406,7 @@
           </w:tcPr>
           <w:p>
             <w:pPr>
+              <w:keepNext/>
               <w:rPr>
                 <w:rFonts w:hint="eastAsia"/>
               </w:rPr>
@@ -1448,6 +1432,7 @@
           </w:tcPr>
           <w:p>
             <w:pPr>
+              <w:keepNext/>
               <w:rPr>
                 <w:rFonts w:hint="eastAsia"/>
               </w:rPr>
@@ -1473,6 +1458,7 @@
           </w:tcPr>
           <w:p>
             <w:pPr>
+              <w:keepNext/>
               <w:rPr>
                 <w:rFonts w:hint="eastAsia"/>
               </w:rPr>
@@ -1489,6 +1475,7 @@
       <w:tr>
         <w:trPr>
           <w:jc w:val="center"/>
+          <w:cantSplit/>
         </w:trPr>
         <w:tc>
           <w:tcPr>
@@ -1586,6 +1573,7 @@
       <w:tr>
         <w:trPr>
           <w:jc w:val="center"/>
+          <w:cantSplit/>
         </w:trPr>
         <w:tc>
           <w:tcPr>
@@ -1683,6 +1671,7 @@
       <w:tr>
         <w:trPr>
           <w:jc w:val="center"/>
+          <w:cantSplit/>
         </w:trPr>
         <w:tc>
           <w:tcPr>
@@ -1780,6 +1769,7 @@
       <w:tr>
         <w:trPr>
           <w:jc w:val="center"/>
+          <w:cantSplit/>
         </w:trPr>
         <w:tc>
           <w:tcPr>
@@ -1892,6 +1882,7 @@
       <w:tr>
         <w:trPr>
           <w:jc w:val="center"/>
+          <w:cantSplit/>
         </w:trPr>
         <w:tc>
           <w:tcPr>
@@ -1990,6 +1981,7 @@
       <w:tr>
         <w:trPr>
           <w:jc w:val="center"/>
+          <w:cantSplit/>
         </w:trPr>
         <w:tc>
           <w:tcPr>
@@ -2080,6 +2072,186 @@
                 <w:lang w:val="fr-FR"/>
               </w:rPr>
               <w:t>Aucun gel perceptible de l’interface.</w:t>
+            </w:r>
+          </w:p>
+        </w:tc>
+      </w:tr>
+      <w:tr>
+        <w:trPr>
+          <w:cantSplit/>
+        </w:trPr>
+        <w:tc>
+          <w:tcPr>
+            <w:tcW w:type="dxa" w:w="2550"/>
+          </w:tcPr>
+          <w:p>
+            <w:r>
+              <w:t>HMI-07</w:t>
+            </w:r>
+          </w:p>
+        </w:tc>
+        <w:tc>
+          <w:tcPr>
+            <w:tcW w:type="dxa" w:w="2550"/>
+          </w:tcPr>
+          <w:p>
+            <w:r>
+              <w:t>Afficher la version et trois onglets en haut de la fenêtre.</w:t>
+            </w:r>
+          </w:p>
+        </w:tc>
+        <w:tc>
+          <w:tcPr>
+            <w:tcW w:type="dxa" w:w="2550"/>
+          </w:tcPr>
+          <w:p>
+            <w:r>
+              <w:t>Must</w:t>
+            </w:r>
+          </w:p>
+        </w:tc>
+        <w:tc>
+          <w:tcPr>
+            <w:tcW w:type="dxa" w:w="2550"/>
+          </w:tcPr>
+          <w:p>
+            <w:r>
+              <w:t>Les trois espaces sont accessibles et le titre correspond à la version du paquet.</w:t>
+            </w:r>
+          </w:p>
+        </w:tc>
+      </w:tr>
+      <w:tr>
+        <w:trPr>
+          <w:cantSplit/>
+        </w:trPr>
+        <w:tc>
+          <w:tcPr>
+            <w:tcW w:type="dxa" w:w="2550"/>
+          </w:tcPr>
+          <w:p>
+            <w:r>
+              <w:t>HMI-08</w:t>
+            </w:r>
+          </w:p>
+        </w:tc>
+        <w:tc>
+          <w:tcPr>
+            <w:tcW w:type="dxa" w:w="2550"/>
+          </w:tcPr>
+          <w:p>
+            <w:r>
+              <w:t>Conserver les réglages propres à chaque espace.</w:t>
+            </w:r>
+          </w:p>
+        </w:tc>
+        <w:tc>
+          <w:tcPr>
+            <w:tcW w:type="dxa" w:w="2550"/>
+          </w:tcPr>
+          <w:p>
+            <w:r>
+              <w:t>Must</w:t>
+            </w:r>
+          </w:p>
+        </w:tc>
+        <w:tc>
+          <w:tcPr>
+            <w:tcW w:type="dxa" w:w="2550"/>
+          </w:tcPr>
+          <w:p>
+            <w:r>
+              <w:t>Changer de bande puis revenir restaure les contrôles ; relancer conserve les réglages enregistrés.</w:t>
+            </w:r>
+          </w:p>
+        </w:tc>
+      </w:tr>
+      <w:tr>
+        <w:trPr>
+          <w:cantSplit/>
+        </w:trPr>
+        <w:tc>
+          <w:tcPr>
+            <w:tcW w:type="dxa" w:w="2550"/>
+          </w:tcPr>
+          <w:p>
+            <w:r>
+              <w:t>HMI-09</w:t>
+            </w:r>
+          </w:p>
+        </w:tc>
+        <w:tc>
+          <w:tcPr>
+            <w:tcW w:type="dxa" w:w="2550"/>
+          </w:tcPr>
+          <w:p>
+            <w:r>
+              <w:t>Régler librement RX et la largeur en ISM.</w:t>
+            </w:r>
+          </w:p>
+        </w:tc>
+        <w:tc>
+          <w:tcPr>
+            <w:tcW w:type="dxa" w:w="2550"/>
+          </w:tcPr>
+          <w:p>
+            <w:r>
+              <w:t>Must</w:t>
+            </w:r>
+          </w:p>
+        </w:tc>
+        <w:tc>
+          <w:tcPr>
+            <w:tcW w:type="dxa" w:w="2550"/>
+          </w:tcPr>
+          <w:p>
+            <w:r>
+              <w:t>Le marqueur et la zone suivent les valeurs, sans imposer une grille de canaux Zigbee.</w:t>
+            </w:r>
+          </w:p>
+        </w:tc>
+      </w:tr>
+      <w:tr>
+        <w:trPr>
+          <w:cantSplit/>
+        </w:trPr>
+        <w:tc>
+          <w:tcPr>
+            <w:tcW w:type="dxa" w:w="2550"/>
+          </w:tcPr>
+          <w:p>
+            <w:r>
+              <w:t>HMI-10</w:t>
+            </w:r>
+          </w:p>
+        </w:tc>
+        <w:tc>
+          <w:tcPr>
+            <w:tcW w:type="dxa" w:w="2550"/>
+          </w:tcPr>
+          <w:p>
+            <w:r>
+              <w:t>Gérer un seul récepteur actif lors du changement de bande.</w:t>
+            </w:r>
+          </w:p>
+        </w:tc>
+        <w:tc>
+          <w:tcPr>
+            <w:tcW w:type="dxa" w:w="2550"/>
+          </w:tcPr>
+          <w:p>
+            <w:r>
+              <w:t>Must</w:t>
+            </w:r>
+          </w:p>
+        </w:tc>
+        <w:tc>
+          <w:tcPr>
+            <w:tcW w:type="dxa" w:w="2550"/>
+          </w:tcPr>
+          <w:p>
+            <w:r>
+              <w:t>La source précédente est arrêtée et libérée avant la nouvelle ouverture ; Qt reste réactif.</w:t>
             </w:r>
           </w:p>
         </w:tc>
@@ -2098,6 +2270,9 @@
         <w:pStyle w:val="Titre2"/>
       </w:pPr>
       <w:r>
+        <w:rPr>
+          <w:color w:val="000000"/>
+        </w:rPr>
         <w:t>4.3 Représentation spectrale</w:t>
       </w:r>
     </w:p>
@@ -2196,6 +2371,9 @@
         <w:pStyle w:val="Titre2"/>
       </w:pPr>
       <w:r>
+        <w:rPr>
+          <w:color w:val="000000"/>
+        </w:rPr>
         <w:t>4.4 Waterfall</w:t>
       </w:r>
     </w:p>
@@ -2264,6 +2442,7 @@
       </w:pPr>
       <w:r>
         <w:rPr>
+          <w:color w:val="000000"/>
           <w:lang w:val="fr-FR"/>
         </w:rPr>
         <w:t>5. Chaîne de réception Zigbee</w:t>
@@ -2278,6 +2457,7 @@
       </w:pPr>
       <w:r>
         <w:rPr>
+          <w:color w:val="000000"/>
           <w:lang w:val="fr-FR"/>
         </w:rPr>
         <w:t>5.1 Paramètres PHY 2,4 GHz</w:t>
@@ -2297,6 +2477,8 @@
       <w:tr>
         <w:trPr>
           <w:jc w:val="center"/>
+          <w:tblHeader/>
+          <w:cantSplit/>
         </w:trPr>
         <w:tc>
           <w:tcPr>
@@ -2305,6 +2487,7 @@
           </w:tcPr>
           <w:p>
             <w:pPr>
+              <w:keepNext/>
               <w:rPr>
                 <w:rFonts w:hint="eastAsia"/>
               </w:rPr>
@@ -2324,6 +2507,7 @@
           </w:tcPr>
           <w:p>
             <w:pPr>
+              <w:keepNext/>
               <w:rPr>
                 <w:rFonts w:hint="eastAsia"/>
               </w:rPr>
@@ -2340,6 +2524,7 @@
       <w:tr>
         <w:trPr>
           <w:jc w:val="center"/>
+          <w:cantSplit/>
         </w:trPr>
         <w:tc>
           <w:tcPr>
@@ -2387,6 +2572,7 @@
       <w:tr>
         <w:trPr>
           <w:jc w:val="center"/>
+          <w:cantSplit/>
         </w:trPr>
         <w:tc>
           <w:tcPr>
@@ -2434,6 +2620,7 @@
       <w:tr>
         <w:trPr>
           <w:jc w:val="center"/>
+          <w:cantSplit/>
         </w:trPr>
         <w:tc>
           <w:tcPr>
@@ -2481,6 +2668,7 @@
       <w:tr>
         <w:trPr>
           <w:jc w:val="center"/>
+          <w:cantSplit/>
         </w:trPr>
         <w:tc>
           <w:tcPr>
@@ -2528,6 +2716,7 @@
       <w:tr>
         <w:trPr>
           <w:jc w:val="center"/>
+          <w:cantSplit/>
         </w:trPr>
         <w:tc>
           <w:tcPr>
@@ -2575,6 +2764,7 @@
       <w:tr>
         <w:trPr>
           <w:jc w:val="center"/>
+          <w:cantSplit/>
         </w:trPr>
         <w:tc>
           <w:tcPr>
@@ -2640,6 +2830,9 @@
         <w:pStyle w:val="Titre2"/>
       </w:pPr>
       <w:r>
+        <w:rPr>
+          <w:color w:val="000000"/>
+        </w:rPr>
         <w:t>5.2 Traitement DSP proposé</w:t>
       </w:r>
     </w:p>
@@ -2787,6 +2980,7 @@
       </w:pPr>
       <w:r>
         <w:rPr>
+          <w:color w:val="000000"/>
           <w:lang w:val="fr-FR"/>
         </w:rPr>
         <w:t>6. Décodage et affichage des trames</w:t>
@@ -2801,6 +2995,7 @@
       </w:pPr>
       <w:r>
         <w:rPr>
+          <w:color w:val="000000"/>
           <w:lang w:val="fr-FR"/>
         </w:rPr>
         <w:t>6.1 Informations minimales par trame</w:t>
@@ -2823,6 +3018,7 @@
         <w:trPr>
           <w:tblHeader/>
           <w:jc w:val="center"/>
+          <w:cantSplit/>
         </w:trPr>
         <w:tc>
           <w:tcPr>
@@ -2837,6 +3033,7 @@
           </w:tcPr>
           <w:p>
             <w:pPr>
+              <w:keepNext/>
               <w:rPr>
                 <w:rFonts w:hint="eastAsia"/>
               </w:rPr>
@@ -2862,6 +3059,7 @@
           </w:tcPr>
           <w:p>
             <w:pPr>
+              <w:keepNext/>
               <w:rPr>
                 <w:rFonts w:hint="eastAsia"/>
               </w:rPr>
@@ -2887,6 +3085,7 @@
           </w:tcPr>
           <w:p>
             <w:pPr>
+              <w:keepNext/>
               <w:rPr>
                 <w:rFonts w:hint="eastAsia"/>
               </w:rPr>
@@ -2912,6 +3111,7 @@
           </w:tcPr>
           <w:p>
             <w:pPr>
+              <w:keepNext/>
               <w:rPr>
                 <w:rFonts w:hint="eastAsia"/>
               </w:rPr>
@@ -2928,6 +3128,7 @@
       <w:tr>
         <w:trPr>
           <w:jc w:val="center"/>
+          <w:cantSplit/>
         </w:trPr>
         <w:tc>
           <w:tcPr>
@@ -3025,6 +3226,7 @@
       <w:tr>
         <w:trPr>
           <w:jc w:val="center"/>
+          <w:cantSplit/>
         </w:trPr>
         <w:tc>
           <w:tcPr>
@@ -3118,6 +3320,7 @@
       <w:tr>
         <w:trPr>
           <w:jc w:val="center"/>
+          <w:cantSplit/>
         </w:trPr>
         <w:tc>
           <w:tcPr>
@@ -3215,6 +3418,7 @@
       <w:tr>
         <w:trPr>
           <w:jc w:val="center"/>
+          <w:cantSplit/>
         </w:trPr>
         <w:tc>
           <w:tcPr>
@@ -3294,13 +3498,8 @@
             </w:tcMar>
           </w:tcPr>
           <w:p>
-            <w:pPr>
-              <w:rPr>
-                <w:rFonts w:hint="eastAsia"/>
-              </w:rPr>
-            </w:pPr>
-            <w:r>
-              <w:t>OK / BAD / inconnu.</w:t>
+            <w:r>
+              <w:t>CRC OK / BAD ou contrôle non renseigné. Distinguer les autres contrôles indiqués par rtl_433.</w:t>
             </w:r>
           </w:p>
         </w:tc>
@@ -3308,6 +3507,7 @@
       <w:tr>
         <w:trPr>
           <w:jc w:val="center"/>
+          <w:cantSplit/>
         </w:trPr>
         <w:tc>
           <w:tcPr>
@@ -3341,13 +3541,8 @@
             </w:tcMar>
           </w:tcPr>
           <w:p>
-            <w:pPr>
-              <w:rPr>
-                <w:rFonts w:hint="eastAsia"/>
-              </w:rPr>
-            </w:pPr>
-            <w:r>
-              <w:t>Octets bruts en hexadécimal.</w:t>
+            <w:r>
+              <w:t>Octets bruts lorsque le protocole les fournit ; résultat structuré sinon.</w:t>
             </w:r>
           </w:p>
         </w:tc>
@@ -3383,17 +3578,8 @@
             </w:tcMar>
           </w:tcPr>
           <w:p>
-            <w:pPr>
-              <w:rPr>
-                <w:rFonts w:hint="eastAsia"/>
-                <w:lang w:val="fr-FR"/>
-              </w:rPr>
-            </w:pPr>
-            <w:r>
-              <w:rPr>
-                <w:lang w:val="fr-FR"/>
-              </w:rPr>
-              <w:t>Copie possible vers presse-papiers.</w:t>
+            <w:r>
+              <w:t>Dump hexadécimal copiable ou mention explicite des octets non fournis.</w:t>
             </w:r>
           </w:p>
         </w:tc>
@@ -3401,6 +3587,7 @@
       <w:tr>
         <w:trPr>
           <w:jc w:val="center"/>
+          <w:cantSplit/>
         </w:trPr>
         <w:tc>
           <w:tcPr>
@@ -3513,6 +3700,7 @@
       </w:pPr>
       <w:r>
         <w:rPr>
+          <w:color w:val="000000"/>
           <w:lang w:val="fr-FR"/>
         </w:rPr>
         <w:t>6.2 Décodage hiérarchique</w:t>
@@ -3624,6 +3812,7 @@
       </w:pPr>
       <w:r>
         <w:rPr>
+          <w:color w:val="000000"/>
           <w:lang w:val="fr-FR"/>
         </w:rPr>
         <w:t>6.3 Chiffrement Zigbee</w:t>
@@ -3648,6 +3837,9 @@
         <w:pStyle w:val="Titre1"/>
       </w:pPr>
       <w:r>
+        <w:rPr>
+          <w:color w:val="000000"/>
+        </w:rPr>
         <w:t>7. Outils de debug</w:t>
       </w:r>
     </w:p>
@@ -3700,7 +3892,7 @@
         </w:rPr>
       </w:pPr>
       <w:r>
-        <w:t>Compteurs : trames/s, total, CRC OK, CRC BAD, pertes estimées.</w:t>
+        <w:t>Compteurs : trames/s, total, CRC OK, CRC BAD, contrôle non renseigné et blocs perdus par la file logicielle. Les mesures de débit et de charge DSP complètent ce diagnostic.</w:t>
       </w:r>
     </w:p>
     <w:p>
@@ -3757,10 +3949,7 @@
         </w:rPr>
       </w:pPr>
       <w:r>
-        <w:rPr>
-          <w:lang w:val="fr-FR"/>
-        </w:rPr>
-        <w:t>Export PCAP/PCAPNG compatible Wireshark à prévoir comme objectif V1 ou V1.1.</w:t>
+        <w:t>Export PCAP IEEE 802.15.4 avec FCS pour Zigbee. En ISM, utiliser JSON ou CSV : les messages hétérogènes ne doivent pas être étiquetés comme trames IEEE 802.15.4. PCAPNG reste une évolution.</w:t>
       </w:r>
     </w:p>
     <w:p>
@@ -3787,6 +3976,7 @@
       </w:pPr>
       <w:r>
         <w:rPr>
+          <w:color w:val="000000"/>
           <w:lang w:val="fr-FR"/>
         </w:rPr>
         <w:t>8. Architecture logicielle</w:t>
@@ -3799,13 +3989,7 @@
         </w:rPr>
       </w:pPr>
       <w:r>
-        <w:rPr>
-          <w:lang w:val="fr-FR"/>
-        </w:rPr>
-        <w:t xml:space="preserve">L’architecture doit éviter tout couplage direct entre l’interface graphique, le matériel SDR et le protocole Zigbee. </w:t>
-      </w:r>
-      <w:r>
-        <w:t>La structure suivante est recommandée :</w:t>
+        <w:t>L’acquisition, le DSP, l’interface et les plugins sont séparés. Les profils Zigbee, ISM 433 et ISM 868 utilisent le même backend SDR et les mêmes widgets de visualisation, avec des paramètres et collections de trames indépendants.</w:t>
       </w:r>
     </w:p>
     <w:tbl>
@@ -3823,6 +4007,8 @@
       <w:tr>
         <w:trPr>
           <w:jc w:val="center"/>
+          <w:tblHeader/>
+          <w:cantSplit/>
         </w:trPr>
         <w:tc>
           <w:tcPr>
@@ -3831,6 +4017,7 @@
           </w:tcPr>
           <w:p>
             <w:pPr>
+              <w:keepNext/>
               <w:rPr>
                 <w:rFonts w:hint="eastAsia"/>
               </w:rPr>
@@ -3850,6 +4037,7 @@
           </w:tcPr>
           <w:p>
             <w:pPr>
+              <w:keepNext/>
               <w:rPr>
                 <w:rFonts w:hint="eastAsia"/>
               </w:rPr>
@@ -3869,6 +4057,7 @@
           </w:tcPr>
           <w:p>
             <w:pPr>
+              <w:keepNext/>
               <w:rPr>
                 <w:rFonts w:hint="eastAsia"/>
               </w:rPr>
@@ -3885,6 +4074,7 @@
       <w:tr>
         <w:trPr>
           <w:jc w:val="center"/>
+          <w:cantSplit/>
         </w:trPr>
         <w:tc>
           <w:tcPr>
@@ -3957,6 +4147,7 @@
       <w:tr>
         <w:trPr>
           <w:jc w:val="center"/>
+          <w:cantSplit/>
         </w:trPr>
         <w:tc>
           <w:tcPr>
@@ -4029,6 +4220,7 @@
       <w:tr>
         <w:trPr>
           <w:jc w:val="center"/>
+          <w:cantSplit/>
         </w:trPr>
         <w:tc>
           <w:tcPr>
@@ -4105,6 +4297,7 @@
       <w:tr>
         <w:trPr>
           <w:jc w:val="center"/>
+          <w:cantSplit/>
         </w:trPr>
         <w:tc>
           <w:tcPr>
@@ -4177,6 +4370,7 @@
       <w:tr>
         <w:trPr>
           <w:jc w:val="center"/>
+          <w:cantSplit/>
         </w:trPr>
         <w:tc>
           <w:tcPr>
@@ -4268,6 +4462,7 @@
       <w:tr>
         <w:trPr>
           <w:jc w:val="center"/>
+          <w:cantSplit/>
         </w:trPr>
         <w:tc>
           <w:tcPr>
@@ -4345,6 +4540,7 @@
       <w:tr>
         <w:trPr>
           <w:jc w:val="center"/>
+          <w:cantSplit/>
         </w:trPr>
         <w:tc>
           <w:tcPr>
@@ -4406,6 +4602,41 @@
             </w:pPr>
             <w:r>
               <w:t>Adaptateurs indépendants de l’UI</w:t>
+            </w:r>
+          </w:p>
+        </w:tc>
+      </w:tr>
+      <w:tr>
+        <w:trPr>
+          <w:cantSplit/>
+        </w:trPr>
+        <w:tc>
+          <w:tcPr>
+            <w:tcW w:type="dxa" w:w="3400"/>
+          </w:tcPr>
+          <w:p>
+            <w:r>
+              <w:t>protocols/ism/</w:t>
+            </w:r>
+          </w:p>
+        </w:tc>
+        <w:tc>
+          <w:tcPr>
+            <w:tcW w:type="dxa" w:w="3400"/>
+          </w:tcPr>
+          <w:p>
+            <w:r>
+              <w:t>Translation, filtrage et interface du moteur rtl_433</w:t>
+            </w:r>
+          </w:p>
+        </w:tc>
+        <w:tc>
+          <w:tcPr>
+            <w:tcW w:type="dxa" w:w="3400"/>
+          </w:tcPr>
+          <w:p>
+            <w:r>
+              <w:t>OOK/ASK, FSK, messages structurés, détection du moteur absent</w:t>
             </w:r>
           </w:p>
         </w:tc>
@@ -4416,6 +4647,9 @@
         <w:pStyle w:val="Titre2"/>
       </w:pPr>
       <w:r>
+        <w:rPr>
+          <w:color w:val="000000"/>
+        </w:rPr>
         <w:t>8.1 Interface de plugin protocolaire</w:t>
       </w:r>
     </w:p>
@@ -4522,6 +4756,9 @@
         <w:pStyle w:val="Titre2"/>
       </w:pPr>
       <w:r>
+        <w:rPr>
+          <w:color w:val="000000"/>
+        </w:rPr>
         <w:t>8.2 Modèle d’exécution</w:t>
       </w:r>
     </w:p>
@@ -4545,10 +4782,7 @@
         </w:rPr>
       </w:pPr>
       <w:r>
-        <w:rPr>
-          <w:lang w:val="fr-FR"/>
-        </w:rPr>
-        <w:t>Thread/worker DSP : traitement du canal sélectionné et production des frames.</w:t>
+        <w:t>Processus DSP séparé de Qt : traitement du canal sélectionné et production des trames. Le plugin ISM lance un processus rtl_433 local alimenté par des échantillons binaires, sans lui donner le contrôle du SDR.</w:t>
       </w:r>
     </w:p>
     <w:p>
@@ -4586,10 +4820,7 @@
         </w:rPr>
       </w:pPr>
       <w:r>
-        <w:rPr>
-          <w:lang w:val="fr-FR"/>
-        </w:rPr>
-        <w:t>Option future : multiprocessing ou extension C/Numba si le DSP Python pur devient insuffisant.</w:t>
+        <w:t>Le DSP utilise des petites FFT groupées et des noyaux Numba compilés. Le transport des I/Q repose sur une file bornée de 64 blocs en mémoire partagée. Les retards persistants doivent rester signalés ; la présence du tampon ne garantit pas la continuité USB.</w:t>
       </w:r>
     </w:p>
     <w:p>
@@ -4597,6 +4828,9 @@
         <w:pStyle w:val="Titre1"/>
       </w:pPr>
       <w:r>
+        <w:rPr>
+          <w:color w:val="000000"/>
+        </w:rPr>
         <w:t>9. Couche SDR et contraintes matérielles</w:t>
       </w:r>
     </w:p>
@@ -4617,6 +4851,7 @@
         <w:trPr>
           <w:tblHeader/>
           <w:jc w:val="center"/>
+          <w:cantSplit/>
         </w:trPr>
         <w:tc>
           <w:tcPr>
@@ -4631,6 +4866,7 @@
           </w:tcPr>
           <w:p>
             <w:pPr>
+              <w:keepNext/>
               <w:rPr>
                 <w:rFonts w:hint="eastAsia"/>
               </w:rPr>
@@ -4656,6 +4892,7 @@
           </w:tcPr>
           <w:p>
             <w:pPr>
+              <w:keepNext/>
               <w:rPr>
                 <w:rFonts w:hint="eastAsia"/>
               </w:rPr>
@@ -4681,6 +4918,7 @@
           </w:tcPr>
           <w:p>
             <w:pPr>
+              <w:keepNext/>
               <w:rPr>
                 <w:rFonts w:hint="eastAsia"/>
               </w:rPr>
@@ -4706,6 +4944,7 @@
           </w:tcPr>
           <w:p>
             <w:pPr>
+              <w:keepNext/>
               <w:rPr>
                 <w:rFonts w:hint="eastAsia"/>
               </w:rPr>
@@ -4722,6 +4961,7 @@
       <w:tr>
         <w:trPr>
           <w:jc w:val="center"/>
+          <w:cantSplit/>
         </w:trPr>
         <w:tc>
           <w:tcPr>
@@ -4819,6 +5059,7 @@
       <w:tr>
         <w:trPr>
           <w:jc w:val="center"/>
+          <w:cantSplit/>
         </w:trPr>
         <w:tc>
           <w:tcPr>
@@ -4916,6 +5157,7 @@
       <w:tr>
         <w:trPr>
           <w:jc w:val="center"/>
+          <w:cantSplit/>
         </w:trPr>
         <w:tc>
           <w:tcPr>
@@ -5013,6 +5255,7 @@
       <w:tr>
         <w:trPr>
           <w:jc w:val="center"/>
+          <w:cantSplit/>
         </w:trPr>
         <w:tc>
           <w:tcPr>
@@ -5046,13 +5289,8 @@
             </w:tcMar>
           </w:tcPr>
           <w:p>
-            <w:pPr>
-              <w:rPr>
-                <w:rFonts w:hint="eastAsia"/>
-              </w:rPr>
-            </w:pPr>
-            <w:r>
-              <w:t>Support initial RTL-SDR.</w:t>
+            <w:r>
+              <w:t>Support Pluto par défaut et RTL-SDR dans leurs bandes RF disponibles.</w:t>
             </w:r>
           </w:p>
         </w:tc>
@@ -5106,6 +5344,7 @@
       <w:tr>
         <w:trPr>
           <w:jc w:val="center"/>
+          <w:cantSplit/>
         </w:trPr>
         <w:tc>
           <w:tcPr>
@@ -5204,6 +5443,7 @@
       <w:tr>
         <w:trPr>
           <w:jc w:val="center"/>
+          <w:cantSplit/>
         </w:trPr>
         <w:tc>
           <w:tcPr>
@@ -5301,6 +5541,7 @@
       <w:tr>
         <w:trPr>
           <w:jc w:val="center"/>
+          <w:cantSplit/>
         </w:trPr>
         <w:tc>
           <w:tcPr>
@@ -5404,6 +5645,9 @@
         <w:pStyle w:val="Titre2"/>
       </w:pPr>
       <w:r>
+        <w:rPr>
+          <w:color w:val="000000"/>
+        </w:rPr>
         <w:t>9.1 Cas RTL-SDR + Zigbee 2,4 GHz</w:t>
       </w:r>
     </w:p>
@@ -5426,6 +5670,9 @@
         <w:pStyle w:val="Titre1"/>
       </w:pPr>
       <w:r>
+        <w:rPr>
+          <w:color w:val="000000"/>
+        </w:rPr>
         <w:t>10. Paramètres utilisateur</w:t>
       </w:r>
     </w:p>
@@ -5438,10 +5685,7 @@
         </w:rPr>
       </w:pPr>
       <w:r>
-        <w:rPr>
-          <w:lang w:val="fr-FR"/>
-        </w:rPr>
-        <w:t>Dernier SDR utilisé, sample rate, gain, fréquence centrale et SPAN.</w:t>
+        <w:t>Par espace de travail : SDR, URI, cadence, gain, AGC, fréquence centrale et SPAN.</w:t>
       </w:r>
     </w:p>
     <w:p>
@@ -5453,10 +5697,7 @@
         </w:rPr>
       </w:pPr>
       <w:r>
-        <w:rPr>
-          <w:lang w:val="fr-FR"/>
-        </w:rPr>
-        <w:t>Protocole sélectionné et canal RX.</w:t>
+        <w:t>Protocole et canal Zigbee ; fréquence RX, largeur, sélection de modulation et décodeurs rtl_433 pour ISM.</w:t>
       </w:r>
     </w:p>
     <w:p>
@@ -5494,10 +5735,7 @@
         </w:rPr>
       </w:pPr>
       <w:r>
-        <w:rPr>
-          <w:lang w:val="fr-FR"/>
-        </w:rPr>
-        <w:t>Clés Zigbee éventuellement configurées : stockage séparé et protégé autant que raisonnablement possible.</w:t>
+        <w:t>Clés Zigbee : conservées en mémoire uniquement, préservées lors du changement d’onglet et effacées à la fermeture. Elles ne sont jamais copiées vers un espace ISM.</w:t>
       </w:r>
     </w:p>
     <w:p>
@@ -5519,10 +5757,7 @@
         </w:rPr>
       </w:pPr>
       <w:r>
-        <w:rPr>
-          <w:lang w:val="fr-FR"/>
-        </w:rPr>
-        <w:t>Les paramètres non sensibles peuvent être stockés dans un fichier JSON/TOML dans le profil utilisateur. Les clés de sécurité ne doivent pas être incluses dans les fichiers de capture ou de log par défaut.</w:t>
+        <w:t>Les paramètres non sensibles sont stockés dans des fichiers JSON séparés du profil utilisateur. Le fichier Zigbee historique est repris sans perte de ses réglages. Les clés ne sont incluses ni dans les préférences ni dans les exports.</w:t>
       </w:r>
     </w:p>
     <w:p>
@@ -5530,6 +5765,9 @@
         <w:pStyle w:val="Titre1"/>
       </w:pPr>
       <w:r>
+        <w:rPr>
+          <w:color w:val="000000"/>
+        </w:rPr>
         <w:t>11. Exigences non fonctionnelles</w:t>
       </w:r>
     </w:p>
@@ -5550,6 +5788,7 @@
         <w:trPr>
           <w:tblHeader/>
           <w:jc w:val="center"/>
+          <w:cantSplit/>
         </w:trPr>
         <w:tc>
           <w:tcPr>
@@ -5564,6 +5803,7 @@
           </w:tcPr>
           <w:p>
             <w:pPr>
+              <w:keepNext/>
               <w:rPr>
                 <w:rFonts w:hint="eastAsia"/>
               </w:rPr>
@@ -5589,6 +5829,7 @@
           </w:tcPr>
           <w:p>
             <w:pPr>
+              <w:keepNext/>
               <w:rPr>
                 <w:rFonts w:hint="eastAsia"/>
               </w:rPr>
@@ -5614,6 +5855,7 @@
           </w:tcPr>
           <w:p>
             <w:pPr>
+              <w:keepNext/>
               <w:rPr>
                 <w:rFonts w:hint="eastAsia"/>
               </w:rPr>
@@ -5639,6 +5881,7 @@
           </w:tcPr>
           <w:p>
             <w:pPr>
+              <w:keepNext/>
               <w:rPr>
                 <w:rFonts w:hint="eastAsia"/>
               </w:rPr>
@@ -5655,6 +5898,7 @@
       <w:tr>
         <w:trPr>
           <w:jc w:val="center"/>
+          <w:cantSplit/>
         </w:trPr>
         <w:tc>
           <w:tcPr>
@@ -5748,6 +5992,7 @@
       <w:tr>
         <w:trPr>
           <w:jc w:val="center"/>
+          <w:cantSplit/>
         </w:trPr>
         <w:tc>
           <w:tcPr>
@@ -5841,6 +6086,7 @@
       <w:tr>
         <w:trPr>
           <w:jc w:val="center"/>
+          <w:cantSplit/>
         </w:trPr>
         <w:tc>
           <w:tcPr>
@@ -5938,6 +6184,7 @@
       <w:tr>
         <w:trPr>
           <w:jc w:val="center"/>
+          <w:cantSplit/>
         </w:trPr>
         <w:tc>
           <w:tcPr>
@@ -6028,6 +6275,7 @@
       <w:tr>
         <w:trPr>
           <w:jc w:val="center"/>
+          <w:cantSplit/>
         </w:trPr>
         <w:tc>
           <w:tcPr>
@@ -6121,6 +6369,7 @@
       <w:tr>
         <w:trPr>
           <w:jc w:val="center"/>
+          <w:cantSplit/>
         </w:trPr>
         <w:tc>
           <w:tcPr>
@@ -6214,6 +6463,7 @@
       <w:tr>
         <w:trPr>
           <w:jc w:val="center"/>
+          <w:cantSplit/>
         </w:trPr>
         <w:tc>
           <w:tcPr>
@@ -6318,6 +6568,9 @@
         <w:pStyle w:val="Titre1"/>
       </w:pPr>
       <w:r>
+        <w:rPr>
+          <w:color w:val="000000"/>
+        </w:rPr>
         <w:t>12. Technologies Python proposées</w:t>
       </w:r>
     </w:p>
@@ -6336,6 +6589,8 @@
       <w:tr>
         <w:trPr>
           <w:jc w:val="center"/>
+          <w:tblHeader/>
+          <w:cantSplit/>
         </w:trPr>
         <w:tc>
           <w:tcPr>
@@ -6344,6 +6599,7 @@
           </w:tcPr>
           <w:p>
             <w:pPr>
+              <w:keepNext/>
               <w:rPr>
                 <w:rFonts w:hint="eastAsia"/>
               </w:rPr>
@@ -6363,6 +6619,7 @@
           </w:tcPr>
           <w:p>
             <w:pPr>
+              <w:keepNext/>
               <w:rPr>
                 <w:rFonts w:hint="eastAsia"/>
               </w:rPr>
@@ -6382,6 +6639,7 @@
           </w:tcPr>
           <w:p>
             <w:pPr>
+              <w:keepNext/>
               <w:rPr>
                 <w:rFonts w:hint="eastAsia"/>
               </w:rPr>
@@ -6398,6 +6656,7 @@
       <w:tr>
         <w:trPr>
           <w:jc w:val="center"/>
+          <w:cantSplit/>
         </w:trPr>
         <w:tc>
           <w:tcPr>
@@ -6470,6 +6729,7 @@
       <w:tr>
         <w:trPr>
           <w:jc w:val="center"/>
+          <w:cantSplit/>
         </w:trPr>
         <w:tc>
           <w:tcPr>
@@ -6542,6 +6802,7 @@
       <w:tr>
         <w:trPr>
           <w:jc w:val="center"/>
+          <w:cantSplit/>
         </w:trPr>
         <w:tc>
           <w:tcPr>
@@ -6610,6 +6871,7 @@
       <w:tr>
         <w:trPr>
           <w:jc w:val="center"/>
+          <w:cantSplit/>
         </w:trPr>
         <w:tc>
           <w:tcPr>
@@ -6678,6 +6940,7 @@
       <w:tr>
         <w:trPr>
           <w:jc w:val="center"/>
+          <w:cantSplit/>
         </w:trPr>
         <w:tc>
           <w:tcPr>
@@ -6750,6 +7013,7 @@
       <w:tr>
         <w:trPr>
           <w:jc w:val="center"/>
+          <w:cantSplit/>
         </w:trPr>
         <w:tc>
           <w:tcPr>
@@ -6822,6 +7086,7 @@
       <w:tr>
         <w:trPr>
           <w:jc w:val="center"/>
+          <w:cantSplit/>
         </w:trPr>
         <w:tc>
           <w:tcPr>
@@ -6887,6 +7152,41 @@
                 <w:lang w:val="fr-FR"/>
               </w:rPr>
               <w:t>Format documenté pour données et métadonnées.</w:t>
+            </w:r>
+          </w:p>
+        </w:tc>
+      </w:tr>
+      <w:tr>
+        <w:trPr>
+          <w:cantSplit/>
+        </w:trPr>
+        <w:tc>
+          <w:tcPr>
+            <w:tcW w:type="dxa" w:w="3400"/>
+          </w:tcPr>
+          <w:p>
+            <w:r>
+              <w:t>Décodage ISM</w:t>
+            </w:r>
+          </w:p>
+        </w:tc>
+        <w:tc>
+          <w:tcPr>
+            <w:tcW w:type="dxa" w:w="3400"/>
+          </w:tcPr>
+          <w:p>
+            <w:r>
+              <w:t>rtl_433 25.12</w:t>
+            </w:r>
+          </w:p>
+        </w:tc>
+        <w:tc>
+          <w:tcPr>
+            <w:tcW w:type="dxa" w:w="3400"/>
+          </w:tcPr>
+          <w:p>
+            <w:r>
+              <w:t>Moteur externe OOK/ASK et FSK</w:t>
             </w:r>
           </w:p>
         </w:tc>
@@ -6897,6 +7197,9 @@
         <w:pStyle w:val="Titre1"/>
       </w:pPr>
       <w:r>
+        <w:rPr>
+          <w:color w:val="000000"/>
+        </w:rPr>
         <w:t>13. Découpage recommandé du développement</w:t>
       </w:r>
     </w:p>
@@ -6915,6 +7218,7 @@
         <w:trPr>
           <w:tblHeader/>
           <w:jc w:val="center"/>
+          <w:cantSplit/>
         </w:trPr>
         <w:tc>
           <w:tcPr>
@@ -6923,6 +7227,7 @@
           </w:tcPr>
           <w:p>
             <w:pPr>
+              <w:keepNext/>
               <w:rPr>
                 <w:rFonts w:hint="eastAsia"/>
               </w:rPr>
@@ -6942,6 +7247,7 @@
           </w:tcPr>
           <w:p>
             <w:pPr>
+              <w:keepNext/>
               <w:rPr>
                 <w:rFonts w:hint="eastAsia"/>
               </w:rPr>
@@ -6958,6 +7264,7 @@
       <w:tr>
         <w:trPr>
           <w:jc w:val="center"/>
+          <w:cantSplit/>
         </w:trPr>
         <w:tc>
           <w:tcPr>
@@ -7005,6 +7312,7 @@
       <w:tr>
         <w:trPr>
           <w:jc w:val="center"/>
+          <w:cantSplit/>
         </w:trPr>
         <w:tc>
           <w:tcPr>
@@ -7056,6 +7364,7 @@
       <w:tr>
         <w:trPr>
           <w:jc w:val="center"/>
+          <w:cantSplit/>
         </w:trPr>
         <w:tc>
           <w:tcPr>
@@ -7107,6 +7416,7 @@
       <w:tr>
         <w:trPr>
           <w:jc w:val="center"/>
+          <w:cantSplit/>
         </w:trPr>
         <w:tc>
           <w:tcPr>
@@ -7159,6 +7469,7 @@
       <w:tr>
         <w:trPr>
           <w:jc w:val="center"/>
+          <w:cantSplit/>
         </w:trPr>
         <w:tc>
           <w:tcPr>
@@ -7210,6 +7521,7 @@
       <w:tr>
         <w:trPr>
           <w:jc w:val="center"/>
+          <w:cantSplit/>
         </w:trPr>
         <w:tc>
           <w:tcPr>
@@ -7254,6 +7566,31 @@
                 <w:lang w:val="fr-FR"/>
               </w:rPr>
               <w:t>Formaliser l’API protocoles et ajouter un second protocole de test pour valider l’extensibilité.</w:t>
+            </w:r>
+          </w:p>
+        </w:tc>
+      </w:tr>
+      <w:tr>
+        <w:trPr>
+          <w:cantSplit/>
+        </w:trPr>
+        <w:tc>
+          <w:tcPr>
+            <w:tcW w:type="dxa" w:w="5100"/>
+          </w:tcPr>
+          <w:p>
+            <w:r>
+              <w:t>Étape 7 — Version 0.2.0 multibande</w:t>
+            </w:r>
+          </w:p>
+        </w:tc>
+        <w:tc>
+          <w:tcPr>
+            <w:tcW w:type="dxa" w:w="5100"/>
+          </w:tcPr>
+          <w:p>
+            <w:r>
+              <w:t>Trois onglets, réglages indépendants et décodage ISM OOK/FSK.</w:t>
             </w:r>
           </w:p>
         </w:tc>
@@ -7264,7 +7601,10 @@
         <w:pStyle w:val="Titre1"/>
       </w:pPr>
       <w:r>
-        <w:t>14. Critères d’acceptation V1</w:t>
+        <w:rPr>
+          <w:color w:val="000000"/>
+        </w:rPr>
+        <w:t>14 Critères d’acceptation Zigbee</w:t>
       </w:r>
     </w:p>
     <w:p>
@@ -7392,6 +7732,9 @@
         <w:pStyle w:val="Titre1"/>
       </w:pPr>
       <w:r>
+        <w:rPr>
+          <w:color w:val="000000"/>
+        </w:rPr>
         <w:t>15. Évolutions envisagées</w:t>
       </w:r>
     </w:p>
@@ -7404,10 +7747,7 @@
         </w:rPr>
       </w:pPr>
       <w:r>
-        <w:rPr>
-          <w:lang w:val="fr-FR"/>
-        </w:rPr>
-        <w:t>Décodage Bluetooth Low Energy, LoRa, FSK/OOK domotique, AIS, ADS-B ou protocoles propriétaires selon matériel RF disponible.</w:t>
+        <w:t>Décodage Bluetooth Low Energy, LoRa CSS, AIS, ADS-B et autres protocoles propriétaires selon le matériel. OOK/ASK et FSK ISM sont désormais inclus ; cela ne signifie pas que chaque appareil de ces bandes est décodable.</w:t>
       </w:r>
     </w:p>
     <w:p>
@@ -7509,9 +7849,9 @@
       </w:pPr>
       <w:r>
         <w:rPr>
-          <w:lang w:val="fr-FR"/>
-        </w:rPr>
-        <w:t>16. Points à figer avant codage</w:t>
+          <w:color w:val="000000"/>
+        </w:rPr>
+        <w:t>16 Points de qualification à compléter</w:t>
       </w:r>
     </w:p>
     <w:p>
@@ -7522,10 +7862,7 @@
         </w:rPr>
       </w:pPr>
       <w:r>
-        <w:rPr>
-          <w:lang w:val="fr-FR"/>
-        </w:rPr>
-        <w:t>Ces points ne bloquent pas la présente spécification, mais devront être confirmés lors du passage au développement :</w:t>
+        <w:t>Les fonctionnalités sont implémentées progressivement ; leur qualification radio nécessite encore les appareils et captures de référence correspondants.</w:t>
       </w:r>
     </w:p>
     <w:p>
@@ -7537,10 +7874,7 @@
         </w:rPr>
       </w:pPr>
       <w:r>
-        <w:rPr>
-          <w:lang w:val="fr-FR"/>
-        </w:rPr>
-        <w:t>Référence exacte de la clé RTL-SDR actuellement disponible.</w:t>
+        <w:t>Modèles des récepteurs et dispositifs 433/868 MHz réellement utilisés, et qualité des antennes adaptées.</w:t>
       </w:r>
     </w:p>
     <w:p>
@@ -7552,10 +7886,7 @@
         </w:rPr>
       </w:pPr>
       <w:r>
-        <w:rPr>
-          <w:lang w:val="fr-FR"/>
-        </w:rPr>
-        <w:t>Utilisation d’un convertisseur 2,4 GHz → IF ou choix d’un SDR couvrant directement 2,4 GHz.</w:t>
+        <w:t>Validation des signaux faibles, décalages de fréquence et interférences sur les réseaux réels.</w:t>
       </w:r>
     </w:p>
     <w:p>
@@ -7567,10 +7898,7 @@
         </w:rPr>
       </w:pPr>
       <w:r>
-        <w:rPr>
-          <w:lang w:val="fr-FR"/>
-        </w:rPr>
-        <w:t>Système d’exploitation prioritaire si autre que Windows 10/11.</w:t>
+        <w:t>Qualification prioritaire sous Windows 10/11 avec Pluto et RTL-SDR.</w:t>
       </w:r>
     </w:p>
     <w:p>
@@ -7582,10 +7910,7 @@
         </w:rPr>
       </w:pPr>
       <w:r>
-        <w:rPr>
-          <w:lang w:val="fr-FR"/>
-        </w:rPr>
-        <w:t>Besoin de déchiffrer le trafic Zigbee du réseau et méthode de fourniture de la Network Key.</w:t>
+        <w:t>Validation du déchiffrement Zigbee avec des clés fournies localement, sans les publier.</w:t>
       </w:r>
     </w:p>
     <w:p>
@@ -7597,10 +7922,7 @@
         </w:rPr>
       </w:pPr>
       <w:r>
-        <w:rPr>
-          <w:lang w:val="fr-FR"/>
-        </w:rPr>
-        <w:t>Niveau de détail souhaité pour le décodage ZCL dès la V1.</w:t>
+        <w:t>Enrichissement progressif des clusters ZCL et de la sélection de décodeurs ISM.</w:t>
       </w:r>
     </w:p>
     <w:p>
@@ -7612,10 +7934,7 @@
         </w:rPr>
       </w:pPr>
       <w:r>
-        <w:rPr>
-          <w:lang w:val="fr-FR"/>
-        </w:rPr>
-        <w:t>Format d’export prioritaire : PCAPNG/Wireshark, JSON, CSV ou plusieurs formats.</w:t>
+        <w:t>Test de réception de deux heures et vérification des pertes matérielles, indépendamment des tests synthétiques.</w:t>
       </w:r>
     </w:p>
     <w:p>
@@ -7627,6 +7946,7 @@
       </w:pPr>
       <w:r>
         <w:rPr>
+          <w:color w:val="000000"/>
           <w:lang w:val="fr-FR"/>
         </w:rPr>
         <w:lastRenderedPageBreak/>
@@ -7671,6 +7991,10 @@
         <w:gridCol w:w="10200"/>
       </w:tblGrid>
       <w:tr>
+        <w:trPr>
+          <w:tblHeader/>
+          <w:cantSplit/>
+        </w:trPr>
         <w:tc>
           <w:tcPr>
             <w:tcW w:w="10200" w:type="dxa"/>
@@ -7684,6 +8008,7 @@
           </w:tcPr>
           <w:p>
             <w:pPr>
+              <w:keepNext/>
               <w:rPr>
                 <w:rFonts w:hint="eastAsia"/>
                 <w:lang w:val="fr-FR"/>
@@ -7712,6 +8037,204 @@
           <w:lang w:val="fr-FR"/>
         </w:rPr>
       </w:pPr>
+    </w:p>
+    <w:p>
+      <w:pPr>
+        <w:pStyle w:val="Titre1"/>
+      </w:pPr>
+      <w:r>
+        <w:rPr>
+          <w:color w:val="000000"/>
+        </w:rPr>
+        <w:t>18 Espaces de travail et décodage ISM</w:t>
+      </w:r>
+    </w:p>
+    <w:p>
+      <w:pPr>
+        <w:pStyle w:val="Titre2"/>
+      </w:pPr>
+      <w:r>
+        <w:rPr>
+          <w:color w:val="000000"/>
+        </w:rPr>
+        <w:t>18.1 Version et cycle de livraison</w:t>
+      </w:r>
+    </w:p>
+    <w:p>
+      <w:r>
+        <w:t>La version est définie une seule fois dans sdr_debug/version.py et utilisée par le titre de la fenêtre, l’en-tête et les métadonnées du paquet. Chaque version livrée incrémente ce numéro : version mineure pour une fonctionnalité et correctif pour une correction. Le journal des changements et la présente spécification doivent suivre ce numéro.</w:t>
+      </w:r>
+    </w:p>
+    <w:p>
+      <w:pPr>
+        <w:pStyle w:val="Titre2"/>
+      </w:pPr>
+      <w:r>
+        <w:rPr>
+          <w:color w:val="000000"/>
+        </w:rPr>
+        <w:t>18.2 Persistance et bascule entre bandes</w:t>
+      </w:r>
+    </w:p>
+    <w:p>
+      <w:r>
+        <w:t>L’onglet Zigbee est affiché au démarrage. Ses préférences historiques restent dans settings.json. ISM 433 et ISM 868 utilisent settings_ism433.json et settings_ism868.json. Les gains, fréquences, FFT, waterfall, filtres, tri chronologique et chemins de capture ne se remplacent pas entre bandes.</w:t>
+      </w:r>
+    </w:p>
+    <w:p>
+      <w:r>
+        <w:t>Pendant une session, les trames, favoris, pause et historique de chaque espace restent en mémoire dans des collections bornées. La liste des trames n’est pas rechargée automatiquement à un redémarrage ; les exports permettent sa conservation. Les clés Zigbee restent seulement en mémoire dans leur espace.</w:t>
+      </w:r>
+    </w:p>
+    <w:p>
+      <w:r>
+        <w:t>Si la réception est active, sélectionner un autre onglet demande l’arrêt du récepteur précédent. Les blocs acceptés sont vidés, une éventuelle capture I/Q est finalisée puis la source du nouvel espace démarre avec ses propres réglages. La capture sur fichier ne redémarre pas automatiquement. En cas de clics rapides, seule la dernière bande demandée est ouverte. Si la réception était arrêtée, la sélection d’un onglet ne démarre pas le SDR.</w:t>
+      </w:r>
+    </w:p>
+    <w:p>
+      <w:pPr>
+        <w:pStyle w:val="Titre2"/>
+      </w:pPr>
+      <w:r>
+        <w:rPr>
+          <w:color w:val="000000"/>
+        </w:rPr>
+        <w:t>18.3 Paramètres des bandes ISM</w:t>
+      </w:r>
+    </w:p>
+    <w:p>
+      <w:r>
+        <w:t>Les valeurs initiales sont RX = Fc = 433,92 MHz pour ISM 433 et 868,30 MHz pour ISM 868, avec une cadence de 1 MS/s et une largeur nominale de 200 kHz. La fréquence RX est réglable dans l’espace concerné ; des présélections servent de raccourcis. Elles ne constituent ni un plan de canaux universel ni une liste de fréquences d’émission autorisées. L’application reste exclusivement réceptrice.</w:t>
+      </w:r>
+    </w:p>
+    <w:p>
+      <w:r>
+        <w:t>La largeur du canal est réglable de 10 à 800 kHz. Elle détermine le filtre numérique et la zone affichée, tandis que le SPAN règle uniquement la vue. Le filtre possède une bande de transition réelle ; le rectangle ne représente pas une coupure idéale. Si le canal n’est pas entièrement inclus dans la bande disponible, son décodage est désactivé et un besoin de recentrage est indiqué.</w:t>
+      </w:r>
+    </w:p>
+    <w:p>
+      <w:pPr>
+        <w:pStyle w:val="Titre2"/>
+      </w:pPr>
+      <w:r>
+        <w:rPr>
+          <w:color w:val="000000"/>
+        </w:rPr>
+        <w:t>18.4 Modulations et décodeurs de dispositifs</w:t>
+      </w:r>
+    </w:p>
+    <w:p>
+      <w:r>
+        <w:t>Le moteur rtl_433 démodule les signaux OOK/ASK et FSK puis applique ses décodeurs de dispositifs. Selon le protocole, le codage peut utiliser PPM, PWM, PCM ou Manchester. Le choix Auto OOK/ASK + FSK conserve les événements reconnus ; les choix OOK/ASK et FSK filtrent les événements selon la modulation annoncée par le moteur. Ils ne désactivent pas les autres calculs internes du moteur.</w:t>
+      </w:r>
+    </w:p>
+    <w:p>
+      <w:r>
+        <w:t>Le détecteur FSK peut être classic, minmax ou auto. La valeur classic est utilisée par défaut pour la démonstration validée. La liste facultative de numéros de décodeurs limite les protocoles examinés ; vide, elle conserve la sélection automatique standard de rtl_433. Certains protocoles du moteur sont désactivés par défaut et nécessitent leur numéro explicite.</w:t>
+      </w:r>
+    </w:p>
+    <w:p>
+      <w:r>
+        <w:t>Une modulation reconnue ne suffit pas à décoder tout appareil : le format du fabricant doit être pris en charge et les données protégées restent soumises à leur chiffrement. LoRa CSS et le décodage universel des protocoles propriétaires ne sont pas inclus dans cette version. Un signal inconnu demeure visible au spectre et peut être enregistré en I/Q pour analyse ultérieure.</w:t>
+      </w:r>
+    </w:p>
+    <w:p>
+      <w:pPr>
+        <w:pStyle w:val="Titre2"/>
+      </w:pPr>
+      <w:r>
+        <w:rPr>
+          <w:color w:val="000000"/>
+        </w:rPr>
+        <w:t>18.5 Affichage et intégrité des événements</w:t>
+      </w:r>
+    </w:p>
+    <w:p>
+      <w:r>
+        <w:t>La vue ISM présente le modèle du dispositif, son identifiant et les mesures fournies, par exemple température, humidité, état de batterie ou contact. Le détail conserve le résultat JSON du moteur, le numéro de décodeur, la modulation, la fréquence et les métadonnées disponibles. Les temps relatifs du moteur sont rattachés au début du flux I/Q, après prise en compte des retards des filtres.</w:t>
+      </w:r>
+    </w:p>
+    <w:p>
+      <w:r>
+        <w:t>CRC OK est réservé à un contrôle CRC explicitement annoncé. Les autres contrôles et leur absence restent distincts. Les événements sans CRC ne sont pas masqués comme des erreurs. Un niveau de paquet non fourni est affiché comme absent ; le RSSI de rtl_433 reste dans ses métadonnées et n’est pas assimilé automatiquement aux dBFS du spectre.</w:t>
+      </w:r>
+    </w:p>
+    <w:p>
+      <w:r>
+        <w:t>Les octets ou bits bruts ne sont montrés que lorsque le moteur les fournit. Pour les messages non alignés sur un octet, la longueur en bits est conservée et le dernier octet peut être complété par des zéros pour l’affichage. Le résultat structuré remplace le dump lorsque les octets manquent. Les exports ISM sont JSON et CSV ; un export PCAP IEEE 802.15.4 de ces événements est refusé avant création du fichier.</w:t>
+      </w:r>
+    </w:p>
+    <w:p>
+      <w:pPr>
+        <w:pStyle w:val="Titre2"/>
+      </w:pPr>
+      <w:r>
+        <w:rPr>
+          <w:color w:val="000000"/>
+        </w:rPr>
+        <w:t>18.6 Installation et exécution du moteur</w:t>
+      </w:r>
+    </w:p>
+    <w:p>
+      <w:r>
+        <w:t>Le script tools/install_rtl433.py télécharge l’archive Windows officielle 25.12, vérifie son SHA-256 et l’installe dans runtime/rtl_433. L’exécutable peut aussi être trouvé dans PATH ou choisi localement. Il n’est ni incorporé au code Python ni téléchargé à chaque démarrage ; ses conditions de licence propres doivent être conservées lors d’une redistribution.</w:t>
+      </w:r>
+    </w:p>
+    <w:p>
+      <w:r>
+        <w:t>rtl_433 reçoit exclusivement les I/Q produits par le backend de l’application. Sous Windows, un tube nommé ouvert en mode binaire évite la corruption observée sur l’entrée standard de la distribution testée. Le moteur externe est arrêté à la fermeture, au changement de configuration et après une discontinuité de la chaîne. En son absence, le spectre reste disponible avec un message explicite ; aucun décodage n’est simulé.</w:t>
+      </w:r>
+    </w:p>
+    <w:p>
+      <w:pPr>
+        <w:pStyle w:val="Titre1"/>
+      </w:pPr>
+      <w:r>
+        <w:rPr>
+          <w:color w:val="000000"/>
+        </w:rPr>
+        <w:t>19 Validation de la version multibande</w:t>
+      </w:r>
+    </w:p>
+    <w:p>
+      <w:r>
+        <w:t>Les critères suivants complètent les tests Zigbee existants. Les données synthétiques valident le traitement logiciel ; elles ne prouvent ni la sensibilité RF ni une réception continue sans pertes sur le matériel réel.</w:t>
+      </w:r>
+    </w:p>
+    <w:p>
+      <w:r>
+        <w:t>V020-01 : afficher exactement trois onglets et une version identique au paquet ; restaurer les paramètres distincts après plusieurs allers-retours et après relancement.</w:t>
+      </w:r>
+    </w:p>
+    <w:p>
+      <w:r>
+        <w:t>V020-02 : vérifier que deux ouvertures SDR ne se chevauchent pas, même lors de sélections rapides ; conserver les trames précédentes et finaliser la capture avant bascule.</w:t>
+      </w:r>
+    </w:p>
+    <w:p>
+      <w:r>
+        <w:t>V020-03 : décoder un signal Nexus OOK synthétique à 25,1 °C et 52 % en blocs successifs ; laisser son CRC comme non renseigné.</w:t>
+      </w:r>
+    </w:p>
+    <w:p>
+      <w:r>
+        <w:t>V020-04 : décoder un signal LaCrosse FSK synthétique portant les mêmes mesures et un CRC valide ; vérifier le temps et l’arrêt du processus externe.</w:t>
+      </w:r>
+    </w:p>
+    <w:p>
+      <w:r>
+        <w:t>V020-05 : tester moteur absent, sélection des décodeurs, filtre de modulation, octets manquants et refus de PCAP ISM sans création de fichier.</w:t>
+      </w:r>
+    </w:p>
+    <w:p>
+      <w:r>
+        <w:t>V020-06 : conserver les tests de Zigbee, filtre FIR, synchronisation, tri, clés, export et arrêt. Qualifier séparément les dispositifs RF réels et le fonctionnement prolongé de deux heures.</w:t>
+      </w:r>
+    </w:p>
+    <w:p>
+      <w:r>
+        <w:t>Références de mise en œuvre : https://github.com/merbanan/rtl_433/releases/tag/25.12 et documentation de la même version ; formats de démonstration documentés dans src/devices/nexus.c et src/devices/lacrosse_tx35.c du projet rtl_433.</w:t>
+      </w:r>
     </w:p>
     <w:sectPr>
       <w:headerReference w:type="default" r:id="rId8"/>
@@ -7769,7 +8292,7 @@
       <w:rPr>
         <w:sz w:val="16"/>
       </w:rPr>
-      <w:t>Version 0.1 — 08/09/2026</w:t>
+      <w:t>Version 0.2.0 — 10/09/2026</w:t>
     </w:r>
   </w:p>
   <w:p>
@@ -7782,24 +8305,7 @@
     <w:r>
       <w:t xml:space="preserve">Page </w:t>
     </w:r>
-    <w:r>
-      <w:fldChar w:fldCharType="begin"/>
-    </w:r>
-    <w:r>
-      <w:instrText>PAGE</w:instrText>
-    </w:r>
-    <w:r>
-      <w:fldChar w:fldCharType="separate"/>
-    </w:r>
-    <w:r>
-      <w:rPr>
-        <w:noProof/>
-      </w:rPr>
-      <w:t>1</w:t>
-    </w:r>
-    <w:r>
-      <w:fldChar w:fldCharType="end"/>
-    </w:r>
+    <w:fldSimple w:instr="PAGE"/>
   </w:p>
 </w:ftr>
 </file>
@@ -7847,12 +8353,7 @@
       </w:rPr>
     </w:pPr>
     <w:r>
-      <w:rPr>
-        <w:i/>
-        <w:sz w:val="16"/>
-        <w:lang w:val="fr-FR"/>
-      </w:rPr>
-      <w:t>Spécification fonctionnelle et technique — Récepteur SDR / Zigbee</w:t>
+      <w:t>SDR Frame Debug  |  Spécification 0.2.0</w:t>
     </w:r>
   </w:p>
 </w:hdr>
@@ -8474,7 +8975,7 @@
       <w:rFonts w:asciiTheme="majorHAnsi" w:eastAsiaTheme="majorEastAsia" w:hAnsiTheme="majorHAnsi" w:cstheme="majorBidi"/>
       <w:b/>
       <w:bCs/>
-      <w:color w:val="365F91" w:themeColor="accent1" w:themeShade="BF"/>
+      <w:color w:val="000000"/>
       <w:sz w:val="32"/>
       <w:szCs w:val="28"/>
     </w:rPr>
@@ -8498,7 +8999,7 @@
       <w:rFonts w:asciiTheme="majorHAnsi" w:eastAsiaTheme="majorEastAsia" w:hAnsiTheme="majorHAnsi" w:cstheme="majorBidi"/>
       <w:b/>
       <w:bCs/>
-      <w:color w:val="4F81BD" w:themeColor="accent1"/>
+      <w:color w:val="000000"/>
       <w:sz w:val="26"/>
       <w:szCs w:val="26"/>
     </w:rPr>
@@ -8522,7 +9023,7 @@
       <w:rFonts w:asciiTheme="majorHAnsi" w:eastAsiaTheme="majorEastAsia" w:hAnsiTheme="majorHAnsi" w:cstheme="majorBidi"/>
       <w:b/>
       <w:bCs/>
-      <w:color w:val="4F81BD" w:themeColor="accent1"/>
+      <w:color w:val="000000"/>
       <w:sz w:val="22"/>
     </w:rPr>
   </w:style>
@@ -8798,15 +9299,12 @@
     <w:qFormat/>
     <w:rsid w:val="00FC693F"/>
     <w:pPr>
-      <w:pBdr>
-        <w:bottom w:val="single" w:sz="8" w:space="4" w:color="4F81BD" w:themeColor="accent1"/>
-      </w:pBdr>
       <w:spacing w:after="300" w:line="240" w:lineRule="auto"/>
       <w:contextualSpacing/>
     </w:pPr>
     <w:rPr>
       <w:rFonts w:asciiTheme="majorHAnsi" w:eastAsiaTheme="majorEastAsia" w:hAnsiTheme="majorHAnsi" w:cstheme="majorBidi"/>
-      <w:color w:val="17365D" w:themeColor="text2" w:themeShade="BF"/>
+      <w:color w:val="000000"/>
       <w:spacing w:val="5"/>
       <w:kern w:val="28"/>
       <w:sz w:val="52"/>
@@ -8845,7 +9343,7 @@
       <w:rFonts w:asciiTheme="majorHAnsi" w:eastAsiaTheme="majorEastAsia" w:hAnsiTheme="majorHAnsi" w:cstheme="majorBidi"/>
       <w:i/>
       <w:iCs/>
-      <w:color w:val="4F81BD" w:themeColor="accent1"/>
+      <w:color w:val="000000"/>
       <w:spacing w:val="15"/>
       <w:sz w:val="24"/>
       <w:szCs w:val="24"/>

</xml_diff>

<commit_message>
Preserve centered ISM signals for decoding
</commit_message>
<xml_diff>
--- a/doc/Specification_Application_SDR_Zigbee.docx
+++ b/doc/Specification_Application_SDR_Zigbee.docx
@@ -44,7 +44,7 @@
         </w:rPr>
       </w:pPr>
       <w:r>
-        <w:t>Version 0.2.0 du 10 septembre 2026</w:t>
+        <w:t>Version 0.2.1 du 10 septembre 2026</w:t>
         <w:br/>
         <w:t>Réception I/Q, spectre, waterfall et décodage de dispositifs</w:t>
       </w:r>
@@ -455,7 +455,7 @@
         </w:rPr>
       </w:pPr>
       <w:r>
-        <w:t>La version 0.2.0 organise le diagnostic dans trois onglets : Zigbee 2,4 GHz, ISM 433 MHz et ISM 868 MHz. Chaque espace conserve ses réglages propres. Zigbee garde sa chaîne IEEE 802.15.4 ; les bandes ISM utilisent les décodeurs de dispositifs OOK/ASK et FSK de rtl_433. Le présent document définit les fonctions attendues et les limites de qualification.</w:t>
+        <w:t>La version 0.2.1 organise le diagnostic dans trois onglets : Zigbee 2,4 GHz, ISM 433 MHz et ISM 868 MHz. Chaque espace conserve ses réglages propres. Zigbee garde sa chaîne IEEE 802.15.4 ; les bandes ISM utilisent les décodeurs de dispositifs OOK/ASK et FSK de rtl_433. Le présent document définit les fonctions attendues et les limites de qualification.</w:t>
       </w:r>
     </w:p>
     <w:p>
@@ -495,7 +495,7 @@
         <w:rPr>
           <w:color w:val="000000"/>
         </w:rPr>
-        <w:t>2.1 Fonctions de la version 0.2.0</w:t>
+        <w:t>2.1 Fonctions de la version 0.2.1</w:t>
       </w:r>
     </w:p>
     <w:p>
@@ -8292,7 +8292,7 @@
       <w:rPr>
         <w:sz w:val="16"/>
       </w:rPr>
-      <w:t>Version 0.2.0 — 10/09/2026</w:t>
+      <w:t>Version 0.2.1 — 10/09/2026</w:t>
     </w:r>
   </w:p>
   <w:p>
@@ -8353,7 +8353,7 @@
       </w:rPr>
     </w:pPr>
     <w:r>
-      <w:t>SDR Frame Debug  |  Spécification 0.2.0</w:t>
+      <w:t>SDR Frame Debug  |  Spécification 0.2.1</w:t>
     </w:r>
   </w:p>
 </w:hdr>

</xml_diff>

<commit_message>
Report rtl_433 input failures
</commit_message>
<xml_diff>
--- a/doc/Specification_Application_SDR_Zigbee.docx
+++ b/doc/Specification_Application_SDR_Zigbee.docx
@@ -44,7 +44,7 @@
         </w:rPr>
       </w:pPr>
       <w:r>
-        <w:t>Version 0.2.1 du 10 septembre 2026</w:t>
+        <w:t>Version 0.2.2 du 10 septembre 2026</w:t>
         <w:br/>
         <w:t>Réception I/Q, spectre, waterfall et décodage de dispositifs</w:t>
       </w:r>
@@ -418,9 +418,7 @@
           <w:rFonts w:hint="eastAsia"/>
         </w:rPr>
       </w:pPr>
-      <w:r>
-        <w:br w:type="page"/>
-      </w:r>
+      <w:r/>
     </w:p>
     <w:p>
       <w:pPr>
@@ -430,7 +428,6 @@
         <w:rPr>
           <w:color w:val="000000"/>
         </w:rPr>
-        <w:lastRenderedPageBreak/>
         <w:t>1. Objet du projet</w:t>
       </w:r>
     </w:p>
@@ -455,7 +452,7 @@
         </w:rPr>
       </w:pPr>
       <w:r>
-        <w:t>La version 0.2.1 organise le diagnostic dans trois onglets : Zigbee 2,4 GHz, ISM 433 MHz et ISM 868 MHz. Chaque espace conserve ses réglages propres. Zigbee garde sa chaîne IEEE 802.15.4 ; les bandes ISM utilisent les décodeurs de dispositifs OOK/ASK et FSK de rtl_433. Le présent document définit les fonctions attendues et les limites de qualification.</w:t>
+        <w:t>La version 0.2.2 organise le diagnostic dans trois onglets : Zigbee 2,4 GHz, ISM 433 MHz et ISM 868 MHz. Chaque espace conserve ses réglages propres. Zigbee garde sa chaîne IEEE 802.15.4 ; les bandes ISM utilisent les décodeurs de dispositifs OOK/ASK et FSK de rtl_433. Le présent document définit les fonctions attendues et les limites de qualification.</w:t>
       </w:r>
     </w:p>
     <w:p>
@@ -495,7 +492,7 @@
         <w:rPr>
           <w:color w:val="000000"/>
         </w:rPr>
-        <w:t>2.1 Fonctions de la version 0.2.1</w:t>
+        <w:t>2.1 Fonctions de la version 0.2.2</w:t>
       </w:r>
     </w:p>
     <w:p>
@@ -2821,7 +2818,6 @@
         <w:rPr>
           <w:lang w:val="fr-FR"/>
         </w:rPr>
-        <w:lastRenderedPageBreak/>
         <w:t>La V1 n’a besoin de démoduler qu’un canal à la fois. Cette hypothèse simplifie fortement la chaîne DSP et reste compatible avec une bande instantanée de quelques MHz.</w:t>
       </w:r>
     </w:p>
@@ -3747,7 +3743,6 @@
         <w:rPr>
           <w:lang w:val="fr-FR"/>
         </w:rPr>
-        <w:lastRenderedPageBreak/>
         <w:t>IEEE 802.15.4 MAC : Frame Control, type de frame, sécurité, PAN ID, adresses source/destination, sequence number, payload MAC.</w:t>
       </w:r>
     </w:p>
@@ -7949,7 +7944,6 @@
           <w:color w:val="000000"/>
           <w:lang w:val="fr-FR"/>
         </w:rPr>
-        <w:lastRenderedPageBreak/>
         <w:t>17. Références techniques</w:t>
       </w:r>
     </w:p>
@@ -8292,7 +8286,7 @@
       <w:rPr>
         <w:sz w:val="16"/>
       </w:rPr>
-      <w:t>Version 0.2.1 — 10/09/2026</w:t>
+      <w:t>Version 0.2.2 — 10/09/2026</w:t>
     </w:r>
   </w:p>
   <w:p>
@@ -8353,7 +8347,7 @@
       </w:rPr>
     </w:pPr>
     <w:r>
-      <w:t>SDR Frame Debug  |  Spécification 0.2.1</w:t>
+      <w:t>SDR Frame Debug  |  Spécification 0.2.2</w:t>
     </w:r>
   </w:p>
 </w:hdr>

</xml_diff>

<commit_message>
Expose unknown OOK bursts in ISM workspaces
</commit_message>
<xml_diff>
--- a/doc/Specification_Application_SDR_Zigbee.docx
+++ b/doc/Specification_Application_SDR_Zigbee.docx
@@ -44,7 +44,7 @@
         </w:rPr>
       </w:pPr>
       <w:r>
-        <w:t>Version 0.2.2 du 10 septembre 2026</w:t>
+        <w:t>Version 0.3.0 du 10 septembre 2026</w:t>
         <w:br/>
         <w:t>Réception I/Q, spectre, waterfall et décodage de dispositifs</w:t>
       </w:r>
@@ -452,7 +452,7 @@
         </w:rPr>
       </w:pPr>
       <w:r>
-        <w:t>La version 0.2.2 organise le diagnostic dans trois onglets : Zigbee 2,4 GHz, ISM 433 MHz et ISM 868 MHz. Chaque espace conserve ses réglages propres. Zigbee garde sa chaîne IEEE 802.15.4 ; les bandes ISM utilisent les décodeurs de dispositifs OOK/ASK et FSK de rtl_433. Le présent document définit les fonctions attendues et les limites de qualification.</w:t>
+        <w:t>La version 0.3.0 organise le diagnostic dans trois onglets : Zigbee 2,4 GHz, ISM 433 MHz et ISM 868 MHz. Chaque espace conserve ses réglages propres. Zigbee garde sa chaîne IEEE 802.15.4 ; les bandes ISM utilisent les décodeurs de dispositifs OOK/ASK et FSK de rtl_433. Le présent document définit les fonctions attendues et les limites de qualification.</w:t>
       </w:r>
     </w:p>
     <w:p>
@@ -492,7 +492,7 @@
         <w:rPr>
           <w:color w:val="000000"/>
         </w:rPr>
-        <w:t>2.1 Fonctions de la version 0.2.2</w:t>
+        <w:t>2.1 Fonctions de la version 0.3.0</w:t>
       </w:r>
     </w:p>
     <w:p>
@@ -8286,7 +8286,7 @@
       <w:rPr>
         <w:sz w:val="16"/>
       </w:rPr>
-      <w:t>Version 0.2.2 — 10/09/2026</w:t>
+      <w:t>Version 0.3.0 — 10/09/2026</w:t>
     </w:r>
   </w:p>
   <w:p>
@@ -8347,7 +8347,7 @@
       </w:rPr>
     </w:pPr>
     <w:r>
-      <w:t>SDR Frame Debug  |  Spécification 0.2.2</w:t>
+      <w:t>SDR Frame Debug  |  Spécification 0.3.0</w:t>
     </w:r>
   </w:p>
 </w:hdr>

</xml_diff>

<commit_message>
Add hexadecimal frame export to all workspaces
</commit_message>
<xml_diff>
--- a/doc/Specification_Application_SDR_Zigbee.docx
+++ b/doc/Specification_Application_SDR_Zigbee.docx
@@ -44,7 +44,7 @@
         </w:rPr>
       </w:pPr>
       <w:r>
-        <w:t>Version 0.3.0 du 10 septembre 2026</w:t>
+        <w:t>Version 0.4.0 du 11 septembre 2026</w:t>
         <w:br/>
         <w:t>Réception I/Q, spectre, waterfall et décodage de dispositifs</w:t>
       </w:r>
@@ -175,7 +175,7 @@
           </w:tcPr>
           <w:p>
             <w:r>
-              <w:t>0.2.0</w:t>
+              <w:t>0.4.0</w:t>
             </w:r>
           </w:p>
         </w:tc>
@@ -222,7 +222,7 @@
           </w:tcPr>
           <w:p>
             <w:r>
-              <w:t>10 septembre 2026</w:t>
+              <w:t>11 septembre 2026</w:t>
             </w:r>
           </w:p>
         </w:tc>
@@ -452,7 +452,7 @@
         </w:rPr>
       </w:pPr>
       <w:r>
-        <w:t>La version 0.3.0 organise le diagnostic dans trois onglets : Zigbee 2,4 GHz, ISM 433 MHz et ISM 868 MHz. Chaque espace conserve ses réglages propres. Zigbee garde sa chaîne IEEE 802.15.4 ; les bandes ISM utilisent les décodeurs de dispositifs OOK/ASK et FSK de rtl_433. Le présent document définit les fonctions attendues et les limites de qualification.</w:t>
+        <w:t>La version 0.4.0 organise le diagnostic dans trois onglets : Zigbee 2,4 GHz, ISM 433 MHz et ISM 868 MHz. Chaque espace conserve ses réglages propres. Zigbee garde sa chaîne IEEE 802.15.4 ; les bandes ISM utilisent les décodeurs de dispositifs OOK/ASK et FSK de rtl_433. Le présent document définit les fonctions attendues et les limites de qualification.</w:t>
       </w:r>
     </w:p>
     <w:p>
@@ -492,7 +492,7 @@
         <w:rPr>
           <w:color w:val="000000"/>
         </w:rPr>
-        <w:t>2.1 Fonctions de la version 0.3.0</w:t>
+        <w:t>2.1 Fonctions de la version 0.4.0</w:t>
       </w:r>
     </w:p>
     <w:p>
@@ -1816,7 +1816,6 @@
               <w:rPr>
                 <w:lang w:val="fr-FR"/>
               </w:rPr>
-              <w:lastRenderedPageBreak/>
               <w:t>curseur Canal RX se verrouille sur les canaux 11 à 26.</w:t>
             </w:r>
           </w:p>
@@ -1838,7 +1837,6 @@
               </w:rPr>
             </w:pPr>
             <w:r>
-              <w:lastRenderedPageBreak/>
               <w:t>Must</w:t>
             </w:r>
           </w:p>
@@ -1870,7 +1868,6 @@
               <w:rPr>
                 <w:lang w:val="fr-FR"/>
               </w:rPr>
-              <w:lastRenderedPageBreak/>
               <w:t>centrale sont indiqués.</w:t>
             </w:r>
           </w:p>
@@ -1898,7 +1895,6 @@
               </w:rPr>
             </w:pPr>
             <w:r>
-              <w:lastRenderedPageBreak/>
               <w:t>HMI-05</w:t>
             </w:r>
           </w:p>
@@ -4415,7 +4411,6 @@
               <w:rPr>
                 <w:lang w:val="fr-FR"/>
               </w:rPr>
-              <w:lastRenderedPageBreak/>
               <w:t>décodage Zigbee</w:t>
             </w:r>
           </w:p>
@@ -4441,14 +4436,12 @@
               <w:rPr>
                 <w:lang w:val="fr-FR"/>
               </w:rPr>
-              <w:lastRenderedPageBreak/>
               <w:t xml:space="preserve">Démod + parseurs </w:t>
             </w:r>
             <w:r>
               <w:rPr>
                 <w:lang w:val="fr-FR"/>
               </w:rPr>
-              <w:lastRenderedPageBreak/>
               <w:t>MAC/NWK/APS/ZCL</w:t>
             </w:r>
           </w:p>
@@ -4476,7 +4469,6 @@
               </w:rPr>
             </w:pPr>
             <w:r>
-              <w:lastRenderedPageBreak/>
               <w:t>capture/</w:t>
             </w:r>
           </w:p>
@@ -5358,7 +5350,6 @@
               </w:rPr>
             </w:pPr>
             <w:r>
-              <w:lastRenderedPageBreak/>
               <w:t>SDR-05</w:t>
             </w:r>
           </w:p>
@@ -6198,7 +6189,6 @@
               </w:rPr>
             </w:pPr>
             <w:r>
-              <w:lastRenderedPageBreak/>
               <w:t>NF-04</w:t>
             </w:r>
           </w:p>
@@ -7430,7 +7420,6 @@
               </w:rPr>
             </w:pPr>
             <w:r>
-              <w:lastRenderedPageBreak/>
               <w:t>Étape 4 — Analyse Zigbee</w:t>
             </w:r>
           </w:p>
@@ -8230,6 +8219,19 @@
         <w:t>Références de mise en œuvre : https://github.com/merbanan/rtl_433/releases/tag/25.12 et documentation de la même version ; formats de démonstration documentés dans src/devices/nexus.c et src/devices/lacrosse_tx35.c du projet rtl_433.</w:t>
       </w:r>
     </w:p>
+    <w:p>
+      <w:pPr>
+        <w:pStyle w:val="Titre1"/>
+      </w:pPr>
+      <w:r>
+        <w:t>20 Export hexadécimal des trames</w:t>
+      </w:r>
+    </w:p>
+    <w:p>
+      <w:r>
+        <w:t>Chaque espace Zigbee ou ISM propose un bouton Sauver hex. Il exporte les trames visibles dont les octets bruts sont disponibles, une trame par ligne en caractères hexadécimaux sans en-tête. Ce format permet un import direct dans les outils d’analyse. Les événements structurés qui ne fournissent pas d’octets bruts ne sont pas inventés dans cet export.</w:t>
+      </w:r>
+    </w:p>
     <w:sectPr>
       <w:headerReference w:type="default" r:id="rId8"/>
       <w:footerReference w:type="default" r:id="rId9"/>
@@ -8286,7 +8288,7 @@
       <w:rPr>
         <w:sz w:val="16"/>
       </w:rPr>
-      <w:t>Version 0.3.0 — 10/09/2026</w:t>
+      <w:t>Version 0.4.0 — 11/09/2026</w:t>
     </w:r>
   </w:p>
   <w:p>
@@ -8347,7 +8349,7 @@
       </w:rPr>
     </w:pPr>
     <w:r>
-      <w:t>SDR Frame Debug  |  Spécification 0.3.0</w:t>
+      <w:t>SDR Frame Debug  |  Spécification 0.4.0</w:t>
     </w:r>
   </w:p>
 </w:hdr>

</xml_diff>

<commit_message>
Add CERBERUS PRO-501 decoder for ISM 868
</commit_message>
<xml_diff>
--- a/doc/Specification_Application_SDR_Zigbee.docx
+++ b/doc/Specification_Application_SDR_Zigbee.docx
@@ -44,7 +44,7 @@
         </w:rPr>
       </w:pPr>
       <w:r>
-        <w:t>Version 0.4.0 du 11 septembre 2026</w:t>
+        <w:t>Version 0.5.0 du 12 septembre 2026</w:t>
         <w:br/>
         <w:t>Réception I/Q, spectre, waterfall et décodage de dispositifs</w:t>
       </w:r>
@@ -175,7 +175,7 @@
           </w:tcPr>
           <w:p>
             <w:r>
-              <w:t>0.4.0</w:t>
+              <w:t>0.5.0</w:t>
             </w:r>
           </w:p>
         </w:tc>
@@ -222,7 +222,7 @@
           </w:tcPr>
           <w:p>
             <w:r>
-              <w:t>11 septembre 2026</w:t>
+              <w:t>12 septembre 2026</w:t>
             </w:r>
           </w:p>
         </w:tc>
@@ -452,7 +452,7 @@
         </w:rPr>
       </w:pPr>
       <w:r>
-        <w:t>La version 0.4.0 organise le diagnostic dans trois onglets : Zigbee 2,4 GHz, ISM 433 MHz et ISM 868 MHz. Chaque espace conserve ses réglages propres. Zigbee garde sa chaîne IEEE 802.15.4 ; les bandes ISM utilisent les décodeurs de dispositifs OOK/ASK et FSK de rtl_433. Le présent document définit les fonctions attendues et les limites de qualification.</w:t>
+        <w:t>La version 0.5.0 organise le diagnostic dans trois onglets : Zigbee 2,4 GHz, ISM 433 MHz et ISM 868 MHz. Chaque espace conserve ses réglages propres. Zigbee garde sa chaîne IEEE 802.15.4 ; les bandes ISM utilisent les décodeurs de dispositifs OOK/ASK et FSK de rtl_433. Le présent document définit les fonctions attendues et les limites de qualification.</w:t>
       </w:r>
     </w:p>
     <w:p>
@@ -492,7 +492,7 @@
         <w:rPr>
           <w:color w:val="000000"/>
         </w:rPr>
-        <w:t>2.1 Fonctions de la version 0.4.0</w:t>
+        <w:t>2.1 Fonctions de la version 0.5.0</w:t>
       </w:r>
     </w:p>
     <w:p>
@@ -8232,6 +8232,19 @@
         <w:t>Chaque espace Zigbee ou ISM propose un bouton Sauver hex. Il exporte les trames visibles dont les octets bruts sont disponibles, une trame par ligne en caractères hexadécimaux sans en-tête. Ce format permet un import direct dans les outils d’analyse. Les événements structurés qui ne fournissent pas d’octets bruts ne sont pas inventés dans cet export.</w:t>
       </w:r>
     </w:p>
+    <w:p>
+      <w:pPr>
+        <w:pStyle w:val="Titre1"/>
+      </w:pPr>
+      <w:r>
+        <w:t>21 Décodeur CERBERUS / Selectronic PRO-501</w:t>
+      </w:r>
+    </w:p>
+    <w:p>
+      <w:r>
+        <w:t>L’espace ISM 868 MHz propose le décodeur CERBERUS PRO-501, activé par défaut et désactivable dans les réglages ISM. Il reçoit des impulsions OOK/PWM sans dépendre de rtl_433 : suppression des glitches courts, regroupement adaptatif de deux populations du ratio HIGH/(HIGH+LOW), puis consensus sur les répétitions de 64 bits. Une rafale validée publie un seul événement ALARM avec une empreinte de capteur, la confiance, les ratios et la durée symbole. L’état de batterie reste UNKNOWN tant que sa position n’est pas confirmée.</w:t>
+      </w:r>
+    </w:p>
     <w:sectPr>
       <w:headerReference w:type="default" r:id="rId8"/>
       <w:footerReference w:type="default" r:id="rId9"/>
@@ -8288,7 +8301,7 @@
       <w:rPr>
         <w:sz w:val="16"/>
       </w:rPr>
-      <w:t>Version 0.4.0 — 11/09/2026</w:t>
+      <w:t>Version 0.5.0 — 12/09/2026</w:t>
     </w:r>
   </w:p>
   <w:p>
@@ -8349,7 +8362,7 @@
       </w:rPr>
     </w:pPr>
     <w:r>
-      <w:t>SDR Frame Debug  |  Spécification 0.4.0</w:t>
+      <w:t>SDR Frame Debug  |  Spécification 0.5.0</w:t>
     </w:r>
   </w:p>
 </w:hdr>

</xml_diff>

<commit_message>
Show decoded fields for selected frames
</commit_message>
<xml_diff>
--- a/doc/Specification_Application_SDR_Zigbee.docx
+++ b/doc/Specification_Application_SDR_Zigbee.docx
@@ -44,7 +44,7 @@
         </w:rPr>
       </w:pPr>
       <w:r>
-        <w:t>Version 0.5.0 du 12 septembre 2026</w:t>
+        <w:t>Version 0.5.1 du 12 septembre 2026</w:t>
         <w:br/>
         <w:t>Réception I/Q, spectre, waterfall et décodage de dispositifs</w:t>
       </w:r>
@@ -175,7 +175,7 @@
           </w:tcPr>
           <w:p>
             <w:r>
-              <w:t>0.5.0</w:t>
+              <w:t>0.5.1</w:t>
             </w:r>
           </w:p>
         </w:tc>
@@ -452,7 +452,7 @@
         </w:rPr>
       </w:pPr>
       <w:r>
-        <w:t>La version 0.5.0 organise le diagnostic dans trois onglets : Zigbee 2,4 GHz, ISM 433 MHz et ISM 868 MHz. Chaque espace conserve ses réglages propres. Zigbee garde sa chaîne IEEE 802.15.4 ; les bandes ISM utilisent les décodeurs de dispositifs OOK/ASK et FSK de rtl_433. Le présent document définit les fonctions attendues et les limites de qualification.</w:t>
+        <w:t>La version 0.5.1 organise le diagnostic dans trois onglets : Zigbee 2,4 GHz, ISM 433 MHz et ISM 868 MHz. Chaque espace conserve ses réglages propres. Zigbee garde sa chaîne IEEE 802.15.4 ; les bandes ISM utilisent les décodeurs de dispositifs OOK/ASK et FSK de rtl_433. Le présent document définit les fonctions attendues et les limites de qualification.</w:t>
       </w:r>
     </w:p>
     <w:p>
@@ -492,7 +492,7 @@
         <w:rPr>
           <w:color w:val="000000"/>
         </w:rPr>
-        <w:t>2.1 Fonctions de la version 0.5.0</w:t>
+        <w:t>2.1 Fonctions de la version 0.5.1</w:t>
       </w:r>
     </w:p>
     <w:p>
@@ -8245,6 +8245,19 @@
         <w:t>L’espace ISM 868 MHz propose le décodeur CERBERUS PRO-501, activé par défaut et désactivable dans les réglages ISM. Il reçoit des impulsions OOK/PWM sans dépendre de rtl_433 : suppression des glitches courts, regroupement adaptatif de deux populations du ratio HIGH/(HIGH+LOW), puis consensus sur les répétitions de 64 bits. Une rafale validée publie un seul événement ALARM avec une empreinte de capteur, la confiance, les ratios et la durée symbole. L’état de batterie reste UNKNOWN tant que sa position n’est pas confirmée.</w:t>
       </w:r>
     </w:p>
+    <w:p>
+      <w:pPr>
+        <w:pStyle w:val="Titre1"/>
+      </w:pPr>
+      <w:r>
+        <w:t>22 Affichage des champs décodés</w:t>
+      </w:r>
+    </w:p>
+    <w:p>
+      <w:r>
+        <w:t>La première trame visible est sélectionnée automatiquement. Le panneau Champ / Valeur développe les données de réception, PHY et protocolaires, notamment les informations CERBERUS PRO-501.</w:t>
+      </w:r>
+    </w:p>
     <w:sectPr>
       <w:headerReference w:type="default" r:id="rId8"/>
       <w:footerReference w:type="default" r:id="rId9"/>
@@ -8301,7 +8314,7 @@
       <w:rPr>
         <w:sz w:val="16"/>
       </w:rPr>
-      <w:t>Version 0.5.0 — 12/09/2026</w:t>
+      <w:t>Version 0.5.1 — 12/09/2026</w:t>
     </w:r>
   </w:p>
   <w:p>
@@ -8362,7 +8375,7 @@
       </w:rPr>
     </w:pPr>
     <w:r>
-      <w:t>SDR Frame Debug  |  Spécification 0.5.0</w:t>
+      <w:t>SDR Frame Debug  |  Spécification 0.5.1</w:t>
     </w:r>
   </w:p>
 </w:hdr>

</xml_diff>

<commit_message>
Add ISM decoder selection list
</commit_message>
<xml_diff>
--- a/doc/Specification_Application_SDR_Zigbee.docx
+++ b/doc/Specification_Application_SDR_Zigbee.docx
@@ -44,7 +44,7 @@
         </w:rPr>
       </w:pPr>
       <w:r>
-        <w:t>Version 0.5.1 du 12 septembre 2026</w:t>
+        <w:t>Version 0.5.2 du 12 septembre 2026</w:t>
         <w:br/>
         <w:t>Réception I/Q, spectre, waterfall et décodage de dispositifs</w:t>
       </w:r>
@@ -175,7 +175,7 @@
           </w:tcPr>
           <w:p>
             <w:r>
-              <w:t>0.5.1</w:t>
+              <w:t>0.5.2</w:t>
             </w:r>
           </w:p>
         </w:tc>
@@ -452,7 +452,7 @@
         </w:rPr>
       </w:pPr>
       <w:r>
-        <w:t>La version 0.5.1 organise le diagnostic dans trois onglets : Zigbee 2,4 GHz, ISM 433 MHz et ISM 868 MHz. Chaque espace conserve ses réglages propres. Zigbee garde sa chaîne IEEE 802.15.4 ; les bandes ISM utilisent les décodeurs de dispositifs OOK/ASK et FSK de rtl_433. Le présent document définit les fonctions attendues et les limites de qualification.</w:t>
+        <w:t>La version 0.5.2 organise le diagnostic dans trois onglets : Zigbee 2,4 GHz, ISM 433 MHz et ISM 868 MHz. Chaque espace conserve ses réglages propres. Zigbee garde sa chaîne IEEE 802.15.4 ; les bandes ISM utilisent les décodeurs de dispositifs OOK/ASK et FSK de rtl_433. Le présent document définit les fonctions attendues et les limites de qualification.</w:t>
       </w:r>
     </w:p>
     <w:p>
@@ -492,7 +492,7 @@
         <w:rPr>
           <w:color w:val="000000"/>
         </w:rPr>
-        <w:t>2.1 Fonctions de la version 0.5.1</w:t>
+        <w:t>2.1 Fonctions de la version 0.5.2</w:t>
       </w:r>
     </w:p>
     <w:p>
@@ -8258,6 +8258,19 @@
         <w:t>La première trame visible est sélectionnée automatiquement. Le panneau Champ / Valeur développe les données de réception, PHY et protocolaires, notamment les informations CERBERUS PRO-501.</w:t>
       </w:r>
     </w:p>
+    <w:p>
+      <w:pPr>
+        <w:pStyle w:val="Titre1"/>
+      </w:pPr>
+      <w:r>
+        <w:t>23 Sélection du décodeur ISM</w:t>
+      </w:r>
+    </w:p>
+    <w:p>
+      <w:r>
+        <w:t>Dans l’onglet ISM 868 MHz, la liste Décodeur ISM propose Automatique (rtl_433 et CERBERUS), CERBERUS PRO-501 ou rtl_433 uniquement. Les futurs décodeurs pourront être ajoutés à cette liste.</w:t>
+      </w:r>
+    </w:p>
     <w:sectPr>
       <w:headerReference w:type="default" r:id="rId8"/>
       <w:footerReference w:type="default" r:id="rId9"/>
@@ -8314,7 +8327,7 @@
       <w:rPr>
         <w:sz w:val="16"/>
       </w:rPr>
-      <w:t>Version 0.5.1 — 12/09/2026</w:t>
+      <w:t>Version 0.5.2 — 12/09/2026</w:t>
     </w:r>
   </w:p>
   <w:p>
@@ -8375,7 +8388,7 @@
       </w:rPr>
     </w:pPr>
     <w:r>
-      <w:t>SDR Frame Debug  |  Spécification 0.5.1</w:t>
+      <w:t>SDR Frame Debug  |  Spécification 0.5.2</w:t>
     </w:r>
   </w:p>
 </w:hdr>

</xml_diff>

<commit_message>
Keep complete CERBERUS burst repetitions
</commit_message>
<xml_diff>
--- a/doc/Specification_Application_SDR_Zigbee.docx
+++ b/doc/Specification_Application_SDR_Zigbee.docx
@@ -44,7 +44,7 @@
         </w:rPr>
       </w:pPr>
       <w:r>
-        <w:t>Version 0.5.2 du 12 septembre 2026</w:t>
+        <w:t>Version 0.5.3 du 12 septembre 2026</w:t>
         <w:br/>
         <w:t>Réception I/Q, spectre, waterfall et décodage de dispositifs</w:t>
       </w:r>
@@ -175,7 +175,7 @@
           </w:tcPr>
           <w:p>
             <w:r>
-              <w:t>0.5.2</w:t>
+              <w:t>0.5.3</w:t>
             </w:r>
           </w:p>
         </w:tc>
@@ -452,7 +452,7 @@
         </w:rPr>
       </w:pPr>
       <w:r>
-        <w:t>La version 0.5.2 organise le diagnostic dans trois onglets : Zigbee 2,4 GHz, ISM 433 MHz et ISM 868 MHz. Chaque espace conserve ses réglages propres. Zigbee garde sa chaîne IEEE 802.15.4 ; les bandes ISM utilisent les décodeurs de dispositifs OOK/ASK et FSK de rtl_433. Le présent document définit les fonctions attendues et les limites de qualification.</w:t>
+        <w:t>La version 0.5.3 organise le diagnostic dans trois onglets : Zigbee 2,4 GHz, ISM 433 MHz et ISM 868 MHz. Chaque espace conserve ses réglages propres. Zigbee garde sa chaîne IEEE 802.15.4 ; les bandes ISM utilisent les décodeurs de dispositifs OOK/ASK et FSK de rtl_433. Le présent document définit les fonctions attendues et les limites de qualification.</w:t>
       </w:r>
     </w:p>
     <w:p>
@@ -492,7 +492,7 @@
         <w:rPr>
           <w:color w:val="000000"/>
         </w:rPr>
-        <w:t>2.1 Fonctions de la version 0.5.2</w:t>
+        <w:t>2.1 Fonctions de la version 0.5.3</w:t>
       </w:r>
     </w:p>
     <w:p>
@@ -8271,6 +8271,19 @@
         <w:t>Dans l’onglet ISM 868 MHz, la liste Décodeur ISM propose Automatique (rtl_433 et CERBERUS), CERBERUS PRO-501 ou rtl_433 uniquement. Les futurs décodeurs pourront être ajoutés à cette liste.</w:t>
       </w:r>
     </w:p>
+    <w:p>
+      <w:pPr>
+        <w:pStyle w:val="Titre1"/>
+      </w:pPr>
+      <w:r>
+        <w:t>24 Fenêtre de rafale CERBERUS</w:t>
+      </w:r>
+    </w:p>
+    <w:p>
+      <w:r>
+        <w:t>La fenêtre de fin de rafale est de 30 ms afin de conserver les répétitions utiles au consensus 64 bits sur les captures réelles PRO-501.</w:t>
+      </w:r>
+    </w:p>
     <w:sectPr>
       <w:headerReference w:type="default" r:id="rId8"/>
       <w:footerReference w:type="default" r:id="rId9"/>
@@ -8327,7 +8340,7 @@
       <w:rPr>
         <w:sz w:val="16"/>
       </w:rPr>
-      <w:t>Version 0.5.2 — 12/09/2026</w:t>
+      <w:t>Version 0.5.3 — 12/09/2026</w:t>
     </w:r>
   </w:p>
   <w:p>
@@ -8388,7 +8401,7 @@
       </w:rPr>
     </w:pPr>
     <w:r>
-      <w:t>SDR Frame Debug  |  Spécification 0.5.2</w:t>
+      <w:t>SDR Frame Debug  |  Spécification 0.5.3</w:t>
     </w:r>
   </w:p>
 </w:hdr>

</xml_diff>

<commit_message>
Show raw hexadecimal data for all frames
</commit_message>
<xml_diff>
--- a/doc/Specification_Application_SDR_Zigbee.docx
+++ b/doc/Specification_Application_SDR_Zigbee.docx
@@ -44,7 +44,7 @@
         </w:rPr>
       </w:pPr>
       <w:r>
-        <w:t>Version 0.5.3 du 12 septembre 2026</w:t>
+        <w:t>Version 0.6.0 du 13 septembre 2026</w:t>
         <w:br/>
         <w:t>Réception I/Q, spectre, waterfall et décodage de dispositifs</w:t>
       </w:r>
@@ -175,7 +175,7 @@
           </w:tcPr>
           <w:p>
             <w:r>
-              <w:t>0.5.3</w:t>
+              <w:t>0.6.0</w:t>
             </w:r>
           </w:p>
         </w:tc>
@@ -222,7 +222,7 @@
           </w:tcPr>
           <w:p>
             <w:r>
-              <w:t>12 septembre 2026</w:t>
+              <w:t>13 septembre 2026</w:t>
             </w:r>
           </w:p>
         </w:tc>
@@ -452,7 +452,7 @@
         </w:rPr>
       </w:pPr>
       <w:r>
-        <w:t>La version 0.5.3 organise le diagnostic dans trois onglets : Zigbee 2,4 GHz, ISM 433 MHz et ISM 868 MHz. Chaque espace conserve ses réglages propres. Zigbee garde sa chaîne IEEE 802.15.4 ; les bandes ISM utilisent les décodeurs de dispositifs OOK/ASK et FSK de rtl_433. Le présent document définit les fonctions attendues et les limites de qualification.</w:t>
+        <w:t>La version 0.6.0 organise le diagnostic dans trois onglets : Zigbee 2,4 GHz, ISM 433 MHz et ISM 868 MHz. Chaque espace conserve ses réglages propres. Zigbee garde sa chaîne IEEE 802.15.4 ; les bandes ISM utilisent les décodeurs de dispositifs OOK/ASK et FSK de rtl_433. Le présent document définit les fonctions attendues et les limites de qualification.</w:t>
       </w:r>
     </w:p>
     <w:p>
@@ -492,7 +492,7 @@
         <w:rPr>
           <w:color w:val="000000"/>
         </w:rPr>
-        <w:t>2.1 Fonctions de la version 0.5.3</w:t>
+        <w:t>2.1 Fonctions de la version 0.6.0</w:t>
       </w:r>
     </w:p>
     <w:p>
@@ -8284,6 +8284,19 @@
         <w:t>La fenêtre de fin de rafale est de 30 ms afin de conserver les répétitions utiles au consensus 64 bits sur les captures réelles PRO-501.</w:t>
       </w:r>
     </w:p>
+    <w:p>
+      <w:pPr>
+        <w:pStyle w:val="Titre1"/>
+      </w:pPr>
+      <w:r>
+        <w:t>25 Données brutes et répétitions</w:t>
+      </w:r>
+    </w:p>
+    <w:p>
+      <w:r>
+        <w:t>Toutes les vues de détail affichent systématiquement le nombre d’octets bruts et leur représentation hexadécimale lorsque les données existent. Une trame CERBERUS validée représente une rafale : le nombre de répétitions indique les copies reçues et fusionnées dans le consensus. En mode automatique, les rafales validées ne sont pas également publiées comme OOK inconnues.</w:t>
+      </w:r>
+    </w:p>
     <w:sectPr>
       <w:headerReference w:type="default" r:id="rId8"/>
       <w:footerReference w:type="default" r:id="rId9"/>
@@ -8340,7 +8353,7 @@
       <w:rPr>
         <w:sz w:val="16"/>
       </w:rPr>
-      <w:t>Version 0.5.3 — 12/09/2026</w:t>
+      <w:t>Version 0.6.0 — 13/09/2026</w:t>
     </w:r>
   </w:p>
   <w:p>
@@ -8401,7 +8414,7 @@
       </w:rPr>
     </w:pPr>
     <w:r>
-      <w:t>SDR Frame Debug  |  Spécification 0.5.3</w:t>
+      <w:t>SDR Frame Debug  |  Spécification 0.6.0</w:t>
     </w:r>
   </w:p>
 </w:hdr>

</xml_diff>

<commit_message>
Show raw hexadecimal values in frame list
</commit_message>
<xml_diff>
--- a/doc/Specification_Application_SDR_Zigbee.docx
+++ b/doc/Specification_Application_SDR_Zigbee.docx
@@ -44,7 +44,7 @@
         </w:rPr>
       </w:pPr>
       <w:r>
-        <w:t>Version 0.6.0 du 13 septembre 2026</w:t>
+        <w:t>Version 0.6.1 du 13 septembre 2026</w:t>
         <w:br/>
         <w:t>Réception I/Q, spectre, waterfall et décodage de dispositifs</w:t>
       </w:r>
@@ -175,7 +175,7 @@
           </w:tcPr>
           <w:p>
             <w:r>
-              <w:t>0.6.0</w:t>
+              <w:t>0.6.1</w:t>
             </w:r>
           </w:p>
         </w:tc>
@@ -452,7 +452,7 @@
         </w:rPr>
       </w:pPr>
       <w:r>
-        <w:t>La version 0.6.0 organise le diagnostic dans trois onglets : Zigbee 2,4 GHz, ISM 433 MHz et ISM 868 MHz. Chaque espace conserve ses réglages propres. Zigbee garde sa chaîne IEEE 802.15.4 ; les bandes ISM utilisent les décodeurs de dispositifs OOK/ASK et FSK de rtl_433. Le présent document définit les fonctions attendues et les limites de qualification.</w:t>
+        <w:t>La version 0.6.1 organise le diagnostic dans trois onglets : Zigbee 2,4 GHz, ISM 433 MHz et ISM 868 MHz. Chaque espace conserve ses réglages propres. Zigbee garde sa chaîne IEEE 802.15.4 ; les bandes ISM utilisent les décodeurs de dispositifs OOK/ASK et FSK de rtl_433. Le présent document définit les fonctions attendues et les limites de qualification.</w:t>
       </w:r>
     </w:p>
     <w:p>
@@ -492,7 +492,7 @@
         <w:rPr>
           <w:color w:val="000000"/>
         </w:rPr>
-        <w:t>2.1 Fonctions de la version 0.6.0</w:t>
+        <w:t>2.1 Fonctions de la version 0.6.1</w:t>
       </w:r>
     </w:p>
     <w:p>
@@ -8297,6 +8297,19 @@
         <w:t>Toutes les vues de détail affichent systématiquement le nombre d’octets bruts et leur représentation hexadécimale lorsque les données existent. Une trame CERBERUS validée représente une rafale : le nombre de répétitions indique les copies reçues et fusionnées dans le consensus. En mode automatique, les rafales validées ne sont pas également publiées comme OOK inconnues.</w:t>
       </w:r>
     </w:p>
+    <w:p>
+      <w:pPr>
+        <w:pStyle w:val="Titre1"/>
+      </w:pPr>
+      <w:r>
+        <w:t>26 Colonne hexadécimale</w:t>
+      </w:r>
+    </w:p>
+    <w:p>
+      <w:r>
+        <w:t>La liste de trames comporte une colonne Hexa brut. Elle affiche les octets disponibles pour chaque message ; lorsque le décodeur ne les fournit pas, la valeur non fourni est explicite.</w:t>
+      </w:r>
+    </w:p>
     <w:sectPr>
       <w:headerReference w:type="default" r:id="rId8"/>
       <w:footerReference w:type="default" r:id="rId9"/>
@@ -8353,7 +8366,7 @@
       <w:rPr>
         <w:sz w:val="16"/>
       </w:rPr>
-      <w:t>Version 0.6.0 — 13/09/2026</w:t>
+      <w:t>Version 0.6.1 — 13/09/2026</w:t>
     </w:r>
   </w:p>
   <w:p>
@@ -8414,7 +8427,7 @@
       </w:rPr>
     </w:pPr>
     <w:r>
-      <w:t>SDR Frame Debug  |  Spécification 0.6.0</w:t>
+      <w:t>SDR Frame Debug  |  Spécification 0.6.1</w:t>
     </w:r>
   </w:p>
 </w:hdr>

</xml_diff>

<commit_message>
Separate demodulated and decoded ISM frames
</commit_message>
<xml_diff>
--- a/doc/Specification_Application_SDR_Zigbee.docx
+++ b/doc/Specification_Application_SDR_Zigbee.docx
@@ -44,7 +44,7 @@
         </w:rPr>
       </w:pPr>
       <w:r>
-        <w:t>Version 0.6.1 du 13 septembre 2026</w:t>
+        <w:t>Version 0.7.0 du 13 septembre 2026</w:t>
         <w:br/>
         <w:t>Réception I/Q, spectre, waterfall et décodage de dispositifs</w:t>
       </w:r>
@@ -175,7 +175,7 @@
           </w:tcPr>
           <w:p>
             <w:r>
-              <w:t>0.6.1</w:t>
+              <w:t>0.7.0</w:t>
             </w:r>
           </w:p>
         </w:tc>
@@ -452,7 +452,7 @@
         </w:rPr>
       </w:pPr>
       <w:r>
-        <w:t>La version 0.6.1 organise le diagnostic dans trois onglets : Zigbee 2,4 GHz, ISM 433 MHz et ISM 868 MHz. Chaque espace conserve ses réglages propres. Zigbee garde sa chaîne IEEE 802.15.4 ; les bandes ISM utilisent les décodeurs de dispositifs OOK/ASK et FSK de rtl_433. Le présent document définit les fonctions attendues et les limites de qualification.</w:t>
+        <w:t>La version 0.7.0 organise le diagnostic dans trois onglets : Zigbee 2,4 GHz, ISM 433 MHz et ISM 868 MHz. Chaque espace conserve ses réglages propres. Zigbee garde sa chaîne IEEE 802.15.4 ; les bandes ISM utilisent les décodeurs de dispositifs OOK/ASK et FSK de rtl_433. Le présent document définit les fonctions attendues et les limites de qualification.</w:t>
       </w:r>
     </w:p>
     <w:p>
@@ -492,7 +492,7 @@
         <w:rPr>
           <w:color w:val="000000"/>
         </w:rPr>
-        <w:t>2.1 Fonctions de la version 0.6.1</w:t>
+        <w:t>2.1 Fonctions de la version 0.7.0</w:t>
       </w:r>
     </w:p>
     <w:p>
@@ -8310,6 +8310,19 @@
         <w:t>La liste de trames comporte une colonne Hexa brut. Elle affiche les octets disponibles pour chaque message ; lorsque le décodeur ne les fournit pas, la valeur non fourni est explicite.</w:t>
       </w:r>
     </w:p>
+    <w:p>
+      <w:pPr>
+        <w:pStyle w:val="Titre1"/>
+      </w:pPr>
+      <w:r>
+        <w:t>27 Séparation réception et décodage ISM</w:t>
+      </w:r>
+    </w:p>
+    <w:p>
+      <w:r>
+        <w:t>La vue Données démodulées liste chaque rafale OOK reçue avec timestamp, durée, nombre d’octets et aperçu hexadécimal. Un clic affiche le flux complet d’impulsions. La vue Trames décodées conserve séparément les interprétations protocolaire, CRC, champs et payload. Une rafale reconnue peut donc être comparée directement à sa réception sans masquer les données d’origine.</w:t>
+      </w:r>
+    </w:p>
     <w:sectPr>
       <w:headerReference w:type="default" r:id="rId8"/>
       <w:footerReference w:type="default" r:id="rId9"/>
@@ -8366,7 +8379,7 @@
       <w:rPr>
         <w:sz w:val="16"/>
       </w:rPr>
-      <w:t>Version 0.6.1 — 13/09/2026</w:t>
+      <w:t>Version 0.7.0 — 13/09/2026</w:t>
     </w:r>
   </w:p>
   <w:p>
@@ -8427,7 +8440,7 @@
       </w:rPr>
     </w:pPr>
     <w:r>
-      <w:t>SDR Frame Debug  |  Spécification 0.6.1</w:t>
+      <w:t>SDR Frame Debug  |  Spécification 0.7.0</w:t>
     </w:r>
   </w:p>
 </w:hdr>

</xml_diff>

<commit_message>
Keep long demodulated OOK bursts
</commit_message>
<xml_diff>
--- a/doc/Specification_Application_SDR_Zigbee.docx
+++ b/doc/Specification_Application_SDR_Zigbee.docx
@@ -44,7 +44,7 @@
         </w:rPr>
       </w:pPr>
       <w:r>
-        <w:t>Version 0.7.0 du 13 septembre 2026</w:t>
+        <w:t>Version 0.7.1 du 13 septembre 2026</w:t>
         <w:br/>
         <w:t>Réception I/Q, spectre, waterfall et décodage de dispositifs</w:t>
       </w:r>
@@ -175,7 +175,7 @@
           </w:tcPr>
           <w:p>
             <w:r>
-              <w:t>0.7.0</w:t>
+              <w:t>0.7.1</w:t>
             </w:r>
           </w:p>
         </w:tc>
@@ -452,7 +452,7 @@
         </w:rPr>
       </w:pPr>
       <w:r>
-        <w:t>La version 0.7.0 organise le diagnostic dans trois onglets : Zigbee 2,4 GHz, ISM 433 MHz et ISM 868 MHz. Chaque espace conserve ses réglages propres. Zigbee garde sa chaîne IEEE 802.15.4 ; les bandes ISM utilisent les décodeurs de dispositifs OOK/ASK et FSK de rtl_433. Le présent document définit les fonctions attendues et les limites de qualification.</w:t>
+        <w:t>La version 0.7.1 organise le diagnostic dans trois onglets : Zigbee 2,4 GHz, ISM 433 MHz et ISM 868 MHz. Chaque espace conserve ses réglages propres. Zigbee garde sa chaîne IEEE 802.15.4 ; les bandes ISM utilisent les décodeurs de dispositifs OOK/ASK et FSK de rtl_433. Le présent document définit les fonctions attendues et les limites de qualification.</w:t>
       </w:r>
     </w:p>
     <w:p>
@@ -492,7 +492,7 @@
         <w:rPr>
           <w:color w:val="000000"/>
         </w:rPr>
-        <w:t>2.1 Fonctions de la version 0.7.0</w:t>
+        <w:t>2.1 Fonctions de la version 0.7.1</w:t>
       </w:r>
     </w:p>
     <w:p>
@@ -8323,6 +8323,19 @@
         <w:t>La vue Données démodulées liste chaque rafale OOK reçue avec timestamp, durée, nombre d’octets et aperçu hexadécimal. Un clic affiche le flux complet d’impulsions. La vue Trames décodées conserve séparément les interprétations protocolaire, CRC, champs et payload. Une rafale reconnue peut donc être comparée directement à sa réception sans masquer les données d’origine.</w:t>
       </w:r>
     </w:p>
+    <w:p>
+      <w:pPr>
+        <w:pStyle w:val="Titre1"/>
+      </w:pPr>
+      <w:r>
+        <w:t>28 Rafales démodulées longues</w:t>
+      </w:r>
+    </w:p>
+    <w:p>
+      <w:r>
+        <w:t>La réception conserve les rafales OOK jusqu’à deux secondes et 4096 impulsions encodées afin que la vue Données démodulées reste cohérente avec le consensus CERBERUS.</w:t>
+      </w:r>
+    </w:p>
     <w:sectPr>
       <w:headerReference w:type="default" r:id="rId8"/>
       <w:footerReference w:type="default" r:id="rId9"/>
@@ -8379,7 +8392,7 @@
       <w:rPr>
         <w:sz w:val="16"/>
       </w:rPr>
-      <w:t>Version 0.7.0 — 13/09/2026</w:t>
+      <w:t>Version 0.7.1 — 13/09/2026</w:t>
     </w:r>
   </w:p>
   <w:p>
@@ -8440,7 +8453,7 @@
       </w:rPr>
     </w:pPr>
     <w:r>
-      <w:t>SDR Frame Debug  |  Spécification 0.7.0</w:t>
+      <w:t>SDR Frame Debug  |  Spécification 0.7.1</w:t>
     </w:r>
   </w:p>
 </w:hdr>

</xml_diff>

<commit_message>
Decode only the selected demodulated burst
</commit_message>
<xml_diff>
--- a/doc/Specification_Application_SDR_Zigbee.docx
+++ b/doc/Specification_Application_SDR_Zigbee.docx
@@ -44,7 +44,7 @@
         </w:rPr>
       </w:pPr>
       <w:r>
-        <w:t>Version 0.7.1 du 13 septembre 2026</w:t>
+        <w:t>Version 0.8.0 du 13 septembre 2026</w:t>
         <w:br/>
         <w:t>Réception I/Q, spectre, waterfall et décodage de dispositifs</w:t>
       </w:r>
@@ -175,7 +175,7 @@
           </w:tcPr>
           <w:p>
             <w:r>
-              <w:t>0.7.1</w:t>
+              <w:t>0.8.0</w:t>
             </w:r>
           </w:p>
         </w:tc>
@@ -452,7 +452,7 @@
         </w:rPr>
       </w:pPr>
       <w:r>
-        <w:t>La version 0.7.1 organise le diagnostic dans trois onglets : Zigbee 2,4 GHz, ISM 433 MHz et ISM 868 MHz. Chaque espace conserve ses réglages propres. Zigbee garde sa chaîne IEEE 802.15.4 ; les bandes ISM utilisent les décodeurs de dispositifs OOK/ASK et FSK de rtl_433. Le présent document définit les fonctions attendues et les limites de qualification.</w:t>
+        <w:t>La version 0.8.0 organise le diagnostic dans trois onglets : Zigbee 2,4 GHz, ISM 433 MHz et ISM 868 MHz. Chaque espace conserve ses réglages propres. Zigbee garde sa chaîne IEEE 802.15.4 ; les bandes ISM utilisent les décodeurs de dispositifs OOK/ASK et FSK de rtl_433. Le présent document définit les fonctions attendues et les limites de qualification.</w:t>
       </w:r>
     </w:p>
     <w:p>
@@ -492,7 +492,7 @@
         <w:rPr>
           <w:color w:val="000000"/>
         </w:rPr>
-        <w:t>2.1 Fonctions de la version 0.7.1</w:t>
+        <w:t>2.1 Fonctions de la version 0.8.0</w:t>
       </w:r>
     </w:p>
     <w:p>
@@ -8336,6 +8336,19 @@
         <w:t>La réception conserve les rafales OOK jusqu’à deux secondes et 4096 impulsions encodées afin que la vue Données démodulées reste cohérente avec le consensus CERBERUS.</w:t>
       </w:r>
     </w:p>
+    <w:p>
+      <w:pPr>
+        <w:pStyle w:val="Titre1"/>
+      </w:pPr>
+      <w:r>
+        <w:t>29 Décodage à la sélection</w:t>
+      </w:r>
+    </w:p>
+    <w:p>
+      <w:r>
+        <w:t>La liste Trames décodées ISM est vidée lors de la sélection d’une nouvelle rafale dans Données démodulées. Le consensus CERBERUS est recalculé à partir de cette seule rafale, ce qui rend explicite le lien réception-versus-décodage. L’horodatage inclut les millisecondes et la colonne hexadécimale est redimensionnable.</w:t>
+      </w:r>
+    </w:p>
     <w:sectPr>
       <w:headerReference w:type="default" r:id="rId8"/>
       <w:footerReference w:type="default" r:id="rId9"/>
@@ -8392,7 +8405,7 @@
       <w:rPr>
         <w:sz w:val="16"/>
       </w:rPr>
-      <w:t>Version 0.7.1 — 13/09/2026</w:t>
+      <w:t>Version 0.8.0 — 13/09/2026</w:t>
     </w:r>
   </w:p>
   <w:p>
@@ -8453,7 +8466,7 @@
       </w:rPr>
     </w:pPr>
     <w:r>
-      <w:t>SDR Frame Debug  |  Spécification 0.7.1</w:t>
+      <w:t>SDR Frame Debug  |  Spécification 0.8.0</w:t>
     </w:r>
   </w:p>
 </w:hdr>

</xml_diff>

<commit_message>
Clarify CERBERUS frame fingerprint
</commit_message>
<xml_diff>
--- a/doc/Specification_Application_SDR_Zigbee.docx
+++ b/doc/Specification_Application_SDR_Zigbee.docx
@@ -44,7 +44,7 @@
         </w:rPr>
       </w:pPr>
       <w:r>
-        <w:t>Version 0.8.0 du 13 septembre 2026</w:t>
+        <w:t>Version 0.8.1 du 13 septembre 2026</w:t>
         <w:br/>
         <w:t>Réception I/Q, spectre, waterfall et décodage de dispositifs</w:t>
       </w:r>
@@ -452,7 +452,7 @@
         </w:rPr>
       </w:pPr>
       <w:r>
-        <w:t>La version 0.8.0 organise le diagnostic dans trois onglets : Zigbee 2,4 GHz, ISM 433 MHz et ISM 868 MHz. Chaque espace conserve ses réglages propres. Zigbee garde sa chaîne IEEE 802.15.4 ; les bandes ISM utilisent les décodeurs de dispositifs OOK/ASK et FSK de rtl_433. Le présent document définit les fonctions attendues et les limites de qualification.</w:t>
+        <w:t>La version 0.8.1 organise le diagnostic dans trois onglets : Zigbee 2,4 GHz, ISM 433 MHz et ISM 868 MHz. Chaque espace conserve ses réglages propres. Zigbee garde sa chaîne IEEE 802.15.4 ; les bandes ISM utilisent les décodeurs de dispositifs OOK/ASK et FSK de rtl_433. Le présent document définit les fonctions attendues et les limites de qualification.</w:t>
       </w:r>
     </w:p>
     <w:p>
@@ -492,7 +492,7 @@
         <w:rPr>
           <w:color w:val="000000"/>
         </w:rPr>
-        <w:t>2.1 Fonctions de la version 0.8.0</w:t>
+        <w:t>2.1 Fonctions de la version 0.8.1</w:t>
       </w:r>
     </w:p>
     <w:p>
@@ -8242,7 +8242,10 @@
     </w:p>
     <w:p>
       <w:r>
-        <w:t>L’espace ISM 868 MHz propose le décodeur CERBERUS PRO-501, activé par défaut et désactivable dans les réglages ISM. Il reçoit des impulsions OOK/PWM sans dépendre de rtl_433 : suppression des glitches courts, regroupement adaptatif de deux populations du ratio HIGH/(HIGH+LOW), puis consensus sur les répétitions de 64 bits. Une rafale validée publie un seul événement ALARM avec une empreinte de capteur, la confiance, les ratios et la durée symbole. L’état de batterie reste UNKNOWN tant que sa position n’est pas confirmée.</w:t>
+        <w:t>L’espace ISM 868 MHz propose le décodeur CERBERUS PRO-501, activé par défaut et désactivable dans les réglages ISM. Il reçoit des impulsions OOK/PWM sans dépendre de rtl_433 : suppression des glitches courts, regroupement adaptatif de deux populations du ratio HIGH/(HIGH+LOW), puis consensus sur les répétitions de 64 bits. Une rafale validée publie un seul événement ALARM avec une empreinte de trame, la confiance, les ratios et la durée symbole. L’état de batterie reste UNKNOWN tant que sa position n’est pas confirmée.</w:t>
+      </w:r>
+      <w:r>
+        <w:t xml:space="preserve"> L’empreinte est calculée sur les 64 bits complets : elle peut varier avec un compteur roulant ou des bits d’état et ne constitue pas un sensor_id. Le champ sensor_id reste non déterminé tant que son emplacement n’est pas validé expérimentalement.</w:t>
       </w:r>
     </w:p>
     <w:p>
@@ -8347,6 +8350,16 @@
     <w:p>
       <w:r>
         <w:t>La liste Trames décodées ISM est vidée lors de la sélection d’une nouvelle rafale dans Données démodulées. Le consensus CERBERUS est recalculé à partir de cette seule rafale, ce qui rend explicite le lien réception-versus-décodage. L’horodatage inclut les millisecondes et la colonne hexadécimale est redimensionnable.</w:t>
+      </w:r>
+    </w:p>
+    <w:p>
+      <w:r>
+        <w:t>30 Identification CERBERUS</w:t>
+      </w:r>
+    </w:p>
+    <w:p>
+      <w:r>
+        <w:t>La valeur affichée dans une trame CERBERUS est une empreinte de trame de diagnostic, dérivée du consensus de 64 bits. Elle ne désigne pas encore le capteur physique et ne doit pas être utilisée pour regrouper des activations. Le contenu brut et les bits consensus restent disponibles pour comparer plusieurs émissions et déterminer les positions réellement stables.</w:t>
       </w:r>
     </w:p>
     <w:sectPr>

</xml_diff>

<commit_message>
Export selected demodulated burst as hex
</commit_message>
<xml_diff>
--- a/doc/Specification_Application_SDR_Zigbee.docx
+++ b/doc/Specification_Application_SDR_Zigbee.docx
@@ -44,7 +44,7 @@
         </w:rPr>
       </w:pPr>
       <w:r>
-        <w:t>Version 0.8.1 du 13 septembre 2026</w:t>
+        <w:t>Version 0.8.2 du 13 septembre 2026</w:t>
         <w:br/>
         <w:t>Réception I/Q, spectre, waterfall et décodage de dispositifs</w:t>
       </w:r>
@@ -452,7 +452,7 @@
         </w:rPr>
       </w:pPr>
       <w:r>
-        <w:t>La version 0.8.1 organise le diagnostic dans trois onglets : Zigbee 2,4 GHz, ISM 433 MHz et ISM 868 MHz. Chaque espace conserve ses réglages propres. Zigbee garde sa chaîne IEEE 802.15.4 ; les bandes ISM utilisent les décodeurs de dispositifs OOK/ASK et FSK de rtl_433. Le présent document définit les fonctions attendues et les limites de qualification.</w:t>
+        <w:t>La version 0.8.2 organise le diagnostic dans trois onglets : Zigbee 2,4 GHz, ISM 433 MHz et ISM 868 MHz. Chaque espace conserve ses réglages propres. Zigbee garde sa chaîne IEEE 802.15.4 ; les bandes ISM utilisent les décodeurs de dispositifs OOK/ASK et FSK de rtl_433. Le présent document définit les fonctions attendues et les limites de qualification.</w:t>
       </w:r>
     </w:p>
     <w:p>
@@ -492,7 +492,7 @@
         <w:rPr>
           <w:color w:val="000000"/>
         </w:rPr>
-        <w:t>2.1 Fonctions de la version 0.8.1</w:t>
+        <w:t>2.1 Fonctions de la version 0.8.2</w:t>
       </w:r>
     </w:p>
     <w:p>
@@ -8360,6 +8360,16 @@
     <w:p>
       <w:r>
         <w:t>La valeur affichée dans une trame CERBERUS est une empreinte de trame de diagnostic, dérivée du consensus de 64 bits. Elle ne désigne pas encore le capteur physique et ne doit pas être utilisée pour regrouper des activations. Le contenu brut et les bits consensus restent disponibles pour comparer plusieurs émissions et déterminer les positions réellement stables.</w:t>
+      </w:r>
+    </w:p>
+    <w:p>
+      <w:r>
+        <w:t>31 Export hexadécimal de la rafale</w:t>
+      </w:r>
+    </w:p>
+    <w:p>
+      <w:r>
+        <w:t>Dans les onglets ISM, Sauver hex exporte en priorité la rafale sélectionnée dans Données démodulées. Le fichier contient les octets de pulses OOK complets, sans les remplacer par la trame courte obtenue après décodage. Sans rafale sélectionnée, les trames décodées visibles sont exportées.</w:t>
       </w:r>
     </w:p>
     <w:sectPr>

</xml_diff>

<commit_message>
Add experimental CERBERUS radio profiles
</commit_message>
<xml_diff>
--- a/doc/Specification_Application_SDR_Zigbee.docx
+++ b/doc/Specification_Application_SDR_Zigbee.docx
@@ -44,7 +44,7 @@
         </w:rPr>
       </w:pPr>
       <w:r>
-        <w:t>Version 0.8.2 du 13 septembre 2026</w:t>
+        <w:t>Version 0.9.0 du 13 septembre 2026</w:t>
         <w:br/>
         <w:t>Réception I/Q, spectre, waterfall et décodage de dispositifs</w:t>
       </w:r>
@@ -452,7 +452,7 @@
         </w:rPr>
       </w:pPr>
       <w:r>
-        <w:t>La version 0.8.2 organise le diagnostic dans trois onglets : Zigbee 2,4 GHz, ISM 433 MHz et ISM 868 MHz. Chaque espace conserve ses réglages propres. Zigbee garde sa chaîne IEEE 802.15.4 ; les bandes ISM utilisent les décodeurs de dispositifs OOK/ASK et FSK de rtl_433. Le présent document définit les fonctions attendues et les limites de qualification.</w:t>
+        <w:t>La version 0.9.0 organise le diagnostic dans trois onglets : Zigbee 2,4 GHz, ISM 433 MHz et ISM 868 MHz. Chaque espace conserve ses réglages propres. Zigbee garde sa chaîne IEEE 802.15.4 ; les bandes ISM utilisent les décodeurs de dispositifs OOK/ASK et FSK de rtl_433. Le présent document définit les fonctions attendues et les limites de qualification.</w:t>
       </w:r>
     </w:p>
     <w:p>
@@ -492,7 +492,7 @@
         <w:rPr>
           <w:color w:val="000000"/>
         </w:rPr>
-        <w:t>2.1 Fonctions de la version 0.8.2</w:t>
+        <w:t>2.1 Fonctions de la version 0.9.0</w:t>
       </w:r>
     </w:p>
     <w:p>
@@ -8370,6 +8370,16 @@
     <w:p>
       <w:r>
         <w:t>Dans les onglets ISM, Sauver hex exporte en priorité la rafale sélectionnée dans Données démodulées. Le fichier contient les octets de pulses OOK complets, sans les remplacer par la trame courte obtenue après décodage. Sans rafale sélectionnée, les trames décodées visibles sont exportées.</w:t>
+      </w:r>
+    </w:p>
+    <w:p>
+      <w:r>
+        <w:t>32 Profils radio CERBERUS</w:t>
+      </w:r>
+    </w:p>
+    <w:p>
+      <w:r>
+        <w:t>Le décodeur compare aussi le flux de bits démodulé à des profils radio expérimentaux A, B et C appris à partir des captures fournies. La comparaison accepte un nombre limité de différences de Hamming et exige une avance sur le second profil. Le résultat est affiché comme profil candidat ou non reconnu. Il ne remplace pas le sensor_id, qui reste non déterminé tant que le champ protocolaire n’est pas démontré.</w:t>
       </w:r>
     </w:p>
     <w:sectPr>

</xml_diff>

<commit_message>
Keep CERBERUS decoding independent from profiles
</commit_message>
<xml_diff>
--- a/doc/Specification_Application_SDR_Zigbee.docx
+++ b/doc/Specification_Application_SDR_Zigbee.docx
@@ -44,7 +44,7 @@
         </w:rPr>
       </w:pPr>
       <w:r>
-        <w:t>Version 0.9.0 du 13 septembre 2026</w:t>
+        <w:t>Version 0.9.1 du 13 septembre 2026</w:t>
         <w:br/>
         <w:t>Réception I/Q, spectre, waterfall et décodage de dispositifs</w:t>
       </w:r>
@@ -452,7 +452,7 @@
         </w:rPr>
       </w:pPr>
       <w:r>
-        <w:t>La version 0.9.0 organise le diagnostic dans trois onglets : Zigbee 2,4 GHz, ISM 433 MHz et ISM 868 MHz. Chaque espace conserve ses réglages propres. Zigbee garde sa chaîne IEEE 802.15.4 ; les bandes ISM utilisent les décodeurs de dispositifs OOK/ASK et FSK de rtl_433. Le présent document définit les fonctions attendues et les limites de qualification.</w:t>
+        <w:t>La version 0.9.1 organise le diagnostic dans trois onglets : Zigbee 2,4 GHz, ISM 433 MHz et ISM 868 MHz. Chaque espace conserve ses réglages propres. Zigbee garde sa chaîne IEEE 802.15.4 ; les bandes ISM utilisent les décodeurs de dispositifs OOK/ASK et FSK de rtl_433. Le présent document définit les fonctions attendues et les limites de qualification.</w:t>
       </w:r>
     </w:p>
     <w:p>
@@ -492,7 +492,7 @@
         <w:rPr>
           <w:color w:val="000000"/>
         </w:rPr>
-        <w:t>2.1 Fonctions de la version 0.9.0</w:t>
+        <w:t>2.1 Fonctions de la version 0.9.1</w:t>
       </w:r>
     </w:p>
     <w:p>
@@ -8380,6 +8380,16 @@
     <w:p>
       <w:r>
         <w:t>Le décodeur compare aussi le flux de bits démodulé à des profils radio expérimentaux A, B et C appris à partir des captures fournies. La comparaison accepte un nombre limité de différences de Hamming et exige une avance sur le second profil. Le résultat est affiché comme profil candidat ou non reconnu. Il ne remplace pas le sensor_id, qui reste non déterminé tant que le champ protocolaire n’est pas démontré.</w:t>
+      </w:r>
+    </w:p>
+    <w:p>
+      <w:r>
+        <w:t>33 Continuité du décodage</w:t>
+      </w:r>
+    </w:p>
+    <w:p>
+      <w:r>
+        <w:t>La comparaison avec les profils radio est une fonction de diagnostic. Une erreur de profil, une capture ambiguë ou un profil absent ne peut pas empêcher la publication d’une trame CERBERUS validée par le démodulateur.</w:t>
       </w:r>
     </w:p>
     <w:sectPr>

</xml_diff>

<commit_message>
Show raw PWM discrimination bitstream
</commit_message>
<xml_diff>
--- a/doc/Specification_Application_SDR_Zigbee.docx
+++ b/doc/Specification_Application_SDR_Zigbee.docx
@@ -44,7 +44,7 @@
         </w:rPr>
       </w:pPr>
       <w:r>
-        <w:t>Version 0.9.1 du 13 septembre 2026</w:t>
+        <w:t>Version 0.10.0 du 13 septembre 2026</w:t>
         <w:br/>
         <w:t>Réception I/Q, spectre, waterfall et décodage de dispositifs</w:t>
       </w:r>
@@ -452,7 +452,7 @@
         </w:rPr>
       </w:pPr>
       <w:r>
-        <w:t>La version 0.9.1 organise le diagnostic dans trois onglets : Zigbee 2,4 GHz, ISM 433 MHz et ISM 868 MHz. Chaque espace conserve ses réglages propres. Zigbee garde sa chaîne IEEE 802.15.4 ; les bandes ISM utilisent les décodeurs de dispositifs OOK/ASK et FSK de rtl_433. Le présent document définit les fonctions attendues et les limites de qualification.</w:t>
+        <w:t>La version 0.10.0 organise le diagnostic dans trois onglets : Zigbee 2,4 GHz, ISM 433 MHz et ISM 868 MHz. Chaque espace conserve ses réglages propres. Zigbee garde sa chaîne IEEE 802.15.4 ; les bandes ISM utilisent les décodeurs de dispositifs OOK/ASK et FSK de rtl_433. Le présent document définit les fonctions attendues et les limites de qualification.</w:t>
       </w:r>
     </w:p>
     <w:p>
@@ -492,7 +492,7 @@
         <w:rPr>
           <w:color w:val="000000"/>
         </w:rPr>
-        <w:t>2.1 Fonctions de la version 0.9.1</w:t>
+        <w:t>2.1 Fonctions de la version 0.10.0</w:t>
       </w:r>
     </w:p>
     <w:p>
@@ -8390,6 +8390,16 @@
     <w:p>
       <w:r>
         <w:t>La comparaison avec les profils radio est une fonction de diagnostic. Une erreur de profil, une capture ambiguë ou un profil absent ne peut pas empêcher la publication d’une trame CERBERUS validée par le démodulateur.</w:t>
+      </w:r>
+    </w:p>
+    <w:p>
+      <w:r>
+        <w:t>34 Visualisation de la discrimination PWM</w:t>
+      </w:r>
+    </w:p>
+    <w:p>
+      <w:r>
+        <w:t>La zone Données démodulées propose une case Afficher bits 0/1. Désactivée, elle présente les enregistrements PWM bruts sous la forme niveau plus durée. Activée, elle affiche le flux binaire complet obtenu avec le seuil adaptatif du rapport cyclique, regroupé visuellement par 64 positions. Ce flux est antérieur à toute synchronisation et à tout consensus.</w:t>
       </w:r>
     </w:p>
     <w:sectPr>

</xml_diff>

<commit_message>
Export the selected PWM display mode
</commit_message>
<xml_diff>
--- a/doc/Specification_Application_SDR_Zigbee.docx
+++ b/doc/Specification_Application_SDR_Zigbee.docx
@@ -44,7 +44,7 @@
         </w:rPr>
       </w:pPr>
       <w:r>
-        <w:t>Version 0.10.0 du 13 septembre 2026</w:t>
+        <w:t>Version 0.10.1 du 13 septembre 2026</w:t>
         <w:br/>
         <w:t>Réception I/Q, spectre, waterfall et décodage de dispositifs</w:t>
       </w:r>
@@ -452,7 +452,7 @@
         </w:rPr>
       </w:pPr>
       <w:r>
-        <w:t>La version 0.10.0 organise le diagnostic dans trois onglets : Zigbee 2,4 GHz, ISM 433 MHz et ISM 868 MHz. Chaque espace conserve ses réglages propres. Zigbee garde sa chaîne IEEE 802.15.4 ; les bandes ISM utilisent les décodeurs de dispositifs OOK/ASK et FSK de rtl_433. Le présent document définit les fonctions attendues et les limites de qualification.</w:t>
+        <w:t>La version 0.10.1 organise le diagnostic dans trois onglets : Zigbee 2,4 GHz, ISM 433 MHz et ISM 868 MHz. Chaque espace conserve ses réglages propres. Zigbee garde sa chaîne IEEE 802.15.4 ; les bandes ISM utilisent les décodeurs de dispositifs OOK/ASK et FSK de rtl_433. Le présent document définit les fonctions attendues et les limites de qualification.</w:t>
       </w:r>
     </w:p>
     <w:p>
@@ -492,7 +492,7 @@
         <w:rPr>
           <w:color w:val="000000"/>
         </w:rPr>
-        <w:t>2.1 Fonctions de la version 0.10.0</w:t>
+        <w:t>2.1 Fonctions de la version 0.10.1</w:t>
       </w:r>
     </w:p>
     <w:p>
@@ -8400,6 +8400,16 @@
     <w:p>
       <w:r>
         <w:t>La zone Données démodulées propose une case Afficher bits 0/1. Désactivée, elle présente les enregistrements PWM bruts sous la forme niveau plus durée. Activée, elle affiche le flux binaire complet obtenu avec le seuil adaptatif du rapport cyclique, regroupé visuellement par 64 positions. Ce flux est antérieur à toute synchronisation et à tout consensus.</w:t>
+      </w:r>
+    </w:p>
+    <w:p>
+      <w:r>
+        <w:t>35 Export suivant le mode de visualisation</w:t>
+      </w:r>
+    </w:p>
+    <w:p>
+      <w:r>
+        <w:t>Sauver hex suit le mode de la case Afficher bits 0/1 pour la rafale sélectionnée. En mode PWM, il produit le fichier hexadécimal des pulses brutes. En mode binaire, il produit un fichier .bits ASCII dont chaque ligne contient 64 bits du flux discriminé brut. Aucun consensus ni réencodage hexadécimal ASCII n’est appliqué au flux binaire.</w:t>
       </w:r>
     </w:p>
     <w:sectPr>

</xml_diff>